<commit_message>
actualiza ERS con login registro y carrito
</commit_message>
<xml_diff>
--- a/ERS.docx
+++ b/ERS.docx
@@ -3,321 +3,1650 @@
 <w:document xmlns:wpc="http://schemas.microsoft.com/office/word/2010/wordprocessingCanvas" xmlns:cx="http://schemas.microsoft.com/office/drawing/2014/chartex" xmlns:cx1="http://schemas.microsoft.com/office/drawing/2015/9/8/chartex" xmlns:cx2="http://schemas.microsoft.com/office/drawing/2015/10/21/chartex" xmlns:cx3="http://schemas.microsoft.com/office/drawing/2016/5/9/chartex" xmlns:cx4="http://schemas.microsoft.com/office/drawing/2016/5/10/chartex" xmlns:cx5="http://schemas.microsoft.com/office/drawing/2016/5/11/chartex" xmlns:cx6="http://schemas.microsoft.com/office/drawing/2016/5/12/chartex" xmlns:cx7="http://schemas.microsoft.com/office/drawing/2016/5/13/chartex" xmlns:cx8="http://schemas.microsoft.com/office/drawing/2016/5/14/chartex" xmlns:mc="http://schemas.openxmlformats.org/markup-compatibility/2006" xmlns:aink="http://schemas.microsoft.com/office/drawing/2016/ink" xmlns:am3d="http://schemas.microsoft.com/office/drawing/2017/model3d" xmlns:o="urn:schemas-microsoft-com:office:office" xmlns:oel="http://schemas.microsoft.com/office/2019/extlst" xmlns:r="http://schemas.openxmlformats.org/officeDocument/2006/relationships" xmlns:m="http://schemas.openxmlformats.org/officeDocument/2006/math" xmlns:v="urn:schemas-microsoft-com:vml" xmlns:wp14="http://schemas.microsoft.com/office/word/2010/wordprocessingDrawing" xmlns:wp="http://schemas.openxmlformats.org/drawingml/2006/wordprocessingDrawing" xmlns:w10="urn:schemas-microsoft-com:office:word" xmlns:w="http://schemas.openxmlformats.org/wordprocessingml/2006/main" xmlns:w14="http://schemas.microsoft.com/office/word/2010/wordml" xmlns:w15="http://schemas.microsoft.com/office/word/2012/wordml" xmlns:w16cex="http://schemas.microsoft.com/office/word/2018/wordml/cex" xmlns:w16cid="http://schemas.microsoft.com/office/word/2016/wordml/cid" xmlns:w16="http://schemas.microsoft.com/office/word/2018/wordml" xmlns:w16du="http://schemas.microsoft.com/office/word/2023/wordml/word16du" xmlns:w16sdtdh="http://schemas.microsoft.com/office/word/2020/wordml/sdtdatahash" xmlns:w16sdtfl="http://schemas.microsoft.com/office/word/2024/wordml/sdtformatlock" xmlns:w16se="http://schemas.microsoft.com/office/word/2015/wordml/symex" xmlns:wpg="http://schemas.microsoft.com/office/word/2010/wordprocessingGroup" xmlns:wpi="http://schemas.microsoft.com/office/word/2010/wordprocessingInk" xmlns:wne="http://schemas.microsoft.com/office/word/2006/wordml" xmlns:wps="http://schemas.microsoft.com/office/word/2010/wordprocessingShape" mc:Ignorable="w14 w15 w16se w16cid w16 w16cex w16sdtdh w16sdtfl w16du wp14">
   <w:body>
     <w:p>
+      <w:pPr>
+        <w:pStyle w:val="Ttulo"/>
+        <w:spacing w:after="80"/>
+        <w:jc w:val="center"/>
+      </w:pPr>
+      <w:r>
+        <w:t>ERS Clínica Aura</w:t>
+      </w:r>
+    </w:p>
+    <w:p>
+      <w:pPr>
+        <w:spacing w:after="80"/>
+        <w:jc w:val="center"/>
+      </w:pPr>
       <w:r>
         <w:rPr>
           <w:b/>
-          <w:bCs/>
         </w:rPr>
-        <w:t># ERS - Clínica Aura</w:t>
-      </w:r>
-    </w:p>
-    <w:p/>
-    <w:p>
-      <w:r>
-        <w:rPr>
-          <w:b/>
-          <w:bCs/>
-        </w:rPr>
-        <w:t>## 1. Introducción</w:t>
-      </w:r>
-    </w:p>
-    <w:p/>
-    <w:p>
-      <w:r>
-        <w:rPr>
-          <w:b/>
-          <w:bCs/>
-        </w:rPr>
-        <w:t>### 1.1 Propósito</w:t>
-      </w:r>
-    </w:p>
-    <w:p/>
-    <w:p>
-      <w:r>
-        <w:t>Este documento describe la primera versión del sitio web de Clínica Aura, una clínica ficticia dedicada a la salud dental y la armonización facial.</w:t>
-      </w:r>
-    </w:p>
-    <w:p/>
-    <w:p>
-      <w:r>
-        <w:rPr>
-          <w:b/>
-          <w:bCs/>
-        </w:rPr>
-        <w:t>### 1.2 Alcance</w:t>
-      </w:r>
-    </w:p>
-    <w:p/>
-    <w:p>
-      <w:r>
-        <w:t>El sitio permite conocer la clínica, revisar tratamientos y enviar una solicitud de reserva. En esta versión los datos no se guardan en una base de datos.</w:t>
-      </w:r>
-    </w:p>
-    <w:p/>
-    <w:p>
-      <w:r>
-        <w:rPr>
-          <w:b/>
-          <w:bCs/>
-        </w:rPr>
-        <w:t>### 1.3 Público objetivo</w:t>
-      </w:r>
-    </w:p>
-    <w:p/>
-    <w:p>
-      <w:r>
-        <w:t>Personas mayores de edad que buscan información básica sobre servicios dentales o faciales y desean solicitar una evaluación.</w:t>
-      </w:r>
-    </w:p>
-    <w:p/>
-    <w:p>
-      <w:r>
-        <w:rPr>
-          <w:b/>
-          <w:bCs/>
-        </w:rPr>
-        <w:t>## 2. Requerimientos funcionales</w:t>
-      </w:r>
-    </w:p>
-    <w:p/>
-    <w:p>
-      <w:r>
-        <w:t>|---|---|</w:t>
-      </w:r>
-    </w:p>
-    <w:p>
-      <w:r>
-        <w:t>| RF-01 | El usuario podrá navegar entre Inicio, Servicios y Reserva. |</w:t>
-      </w:r>
-    </w:p>
-    <w:p>
-      <w:r>
-        <w:t>| RF-02 | El usuario podrá revisar tratamientos dentales, estéticos y faciales. |</w:t>
-      </w:r>
-    </w:p>
-    <w:p>
-      <w:r>
-        <w:t>| RF-03 | El usuario podrá ver imágenes relacionadas con los servicios. |</w:t>
-      </w:r>
-    </w:p>
-    <w:p>
-      <w:r>
-        <w:t>| RF-04 | El usuario podrá reproducir un video educativo desde la página de inicio. |</w:t>
-      </w:r>
-    </w:p>
-    <w:p>
-      <w:r>
-        <w:t>| RF-05 | El usuario podrá completar un formulario de reserva. |</w:t>
-      </w:r>
-    </w:p>
-    <w:p>
-      <w:r>
-        <w:lastRenderedPageBreak/>
-        <w:t>| RF-06 | JavaScript validará nombre, RUT, correo y servicio. |</w:t>
-      </w:r>
-    </w:p>
-    <w:p>
-      <w:r>
-        <w:t>| RF-07 | El sistema mostrará mensajes específicos junto a cada campo incorrecto. |</w:t>
-      </w:r>
-    </w:p>
-    <w:p>
-      <w:r>
-        <w:t>| RF-08 | El botón Limpiar eliminará los datos y mensajes del formulario. |</w:t>
-      </w:r>
-    </w:p>
-    <w:p/>
-    <w:p>
-      <w:r>
-        <w:rPr>
-          <w:b/>
-          <w:bCs/>
-        </w:rPr>
-        <w:t>## 3. Requerimientos no funcionales</w:t>
-      </w:r>
-    </w:p>
-    <w:p/>
-    <w:p>
-      <w:r>
-        <w:t>|---|---|</w:t>
-      </w:r>
-    </w:p>
-    <w:p>
-      <w:r>
-        <w:t>| RNF-01 | El sitio utilizará HTML5 semántico. |</w:t>
-      </w:r>
-    </w:p>
-    <w:p>
-      <w:r>
-        <w:t>| RNF-02 | Los estilos estarán en una hoja CSS externa. |</w:t>
-      </w:r>
-    </w:p>
-    <w:p>
-      <w:r>
-        <w:t>| RNF-03 | La programación estará en un archivo JavaScript externo. |</w:t>
-      </w:r>
-    </w:p>
-    <w:p>
-      <w:r>
-        <w:t xml:space="preserve">| RNF-04 | El diseño se adaptará a computadores, </w:t>
-      </w:r>
-      <w:proofErr w:type="spellStart"/>
-      <w:r>
-        <w:t>tablets</w:t>
-      </w:r>
-      <w:proofErr w:type="spellEnd"/>
-      <w:r>
-        <w:t xml:space="preserve"> y celulares. |</w:t>
-      </w:r>
-    </w:p>
-    <w:p>
-      <w:r>
-        <w:t>| RNF-05 | Las imágenes tendrán texto alternativo y el formulario tendrá etiquetas asociadas. |</w:t>
-      </w:r>
-    </w:p>
-    <w:p>
-      <w:r>
-        <w:t>| RNF-06 | El proyecto podrá ejecutarse localmente mediante Apache en XAMPP. |</w:t>
-      </w:r>
-    </w:p>
-    <w:p/>
-    <w:p>
-      <w:r>
-        <w:rPr>
-          <w:b/>
-          <w:bCs/>
-        </w:rPr>
-        <w:t>## 4. Herramientas y tecnologías</w:t>
-      </w:r>
-    </w:p>
-    <w:p/>
-    <w:p>
-      <w:r>
-        <w:t>- Visual Studio Code para editar el proyecto.</w:t>
-      </w:r>
-    </w:p>
-    <w:p>
-      <w:r>
-        <w:t>- HTML5 para la estructura y el contenido.</w:t>
-      </w:r>
-    </w:p>
-    <w:p>
-      <w:r>
-        <w:t>- CSS3 externo para personalizar los colores del sitio.</w:t>
-      </w:r>
-    </w:p>
-    <w:p>
-      <w:r>
-        <w:t>- JavaScript para interacción y validación.</w:t>
-      </w:r>
-    </w:p>
-    <w:p>
-      <w:r>
-        <w:t>- XAMPP/Apache para ejecutar el sitio en `localhost`.</w:t>
-      </w:r>
-    </w:p>
-    <w:p>
-      <w:r>
-        <w:t>- Git y GitHub para control de versiones y trabajo colaborativo.</w:t>
-      </w:r>
-    </w:p>
-    <w:p/>
-    <w:p>
-      <w:r>
-        <w:rPr>
-          <w:b/>
-          <w:bCs/>
-        </w:rPr>
-        <w:t>## 5. Propuesta de solución</w:t>
-      </w:r>
-    </w:p>
-    <w:p/>
-    <w:p>
-      <w:r>
-        <w:lastRenderedPageBreak/>
-        <w:t xml:space="preserve">Se propone una interfaz limpia en tonos azul y turquesa, asociados a salud y confianza. La información se divide en tres páginas para facilitar la navegación y mantener el código ordenado. La reserva funciona como demostración </w:t>
-      </w:r>
-      <w:proofErr w:type="spellStart"/>
-      <w:r>
-        <w:t>frontend</w:t>
-      </w:r>
-      <w:proofErr w:type="spellEnd"/>
-      <w:r>
-        <w:t xml:space="preserve"> y confirma los datos solamente cuando superan todas las validaciones.</w:t>
-      </w:r>
-    </w:p>
-    <w:p/>
-    <w:p>
-      <w:r>
-        <w:rPr>
-          <w:b/>
-          <w:bCs/>
-        </w:rPr>
-        <w:t>## 6. Restricciones</w:t>
-      </w:r>
-    </w:p>
-    <w:p/>
-    <w:p>
-      <w:r>
-        <w:t>- El sitio no almacena datos.</w:t>
-      </w:r>
-    </w:p>
-    <w:p>
-      <w:r>
-        <w:t>- El formulario no envía correos ni confirma horas reales.</w:t>
-      </w:r>
-    </w:p>
-    <w:p>
-      <w:r>
-        <w:t>- Los precios mostrados son referenciales y corresponden a una clínica ficticia.</w:t>
-      </w:r>
-    </w:p>
-    <w:p>
-      <w:r>
-        <w:t>- El video requiere conexión a Internet para reproducirse.</w:t>
-      </w:r>
-    </w:p>
-    <w:p/>
-    <w:p>
-      <w:r>
-        <w:rPr>
-          <w:b/>
-          <w:bCs/>
-        </w:rPr>
-        <w:t>## 7. Mejoras futuras</w:t>
-      </w:r>
-    </w:p>
-    <w:p/>
-    <w:p>
-      <w:r>
-        <w:t>- Agregar una base de datos para almacenar reservas.</w:t>
-      </w:r>
-    </w:p>
-    <w:p>
-      <w:r>
-        <w:t>- Permitir inicio de sesión de pacientes.</w:t>
-      </w:r>
-    </w:p>
-    <w:p>
-      <w:r>
-        <w:t>- Mostrar horas disponibles en tiempo real.</w:t>
-      </w:r>
-    </w:p>
-    <w:p>
-      <w:r>
-        <w:t>- Enviar confirmaciones por correo.</w:t>
-      </w:r>
-    </w:p>
-    <w:p>
-      <w:r>
-        <w:t>- Incorporar un panel de administración.</w:t>
-      </w:r>
-    </w:p>
-    <w:p/>
-    <w:p/>
+        <w:t>Especificación de Requisitos del Software - Versión 1 actualizada</w:t>
+      </w:r>
+    </w:p>
+    <w:p>
+      <w:pPr>
+        <w:spacing w:after="80"/>
+      </w:pPr>
+      <w:r>
+        <w:t>Este documento describe el alcance actual del sitio web frontend de Clínica Aura e incorpora las funciones de catálogo, carrito, registro de usuarios e inicio de sesión implementadas en el proyecto.</w:t>
+      </w:r>
+    </w:p>
+    <w:p>
+      <w:pPr>
+        <w:pStyle w:val="Ttulo1"/>
+        <w:spacing w:after="80"/>
+      </w:pPr>
+      <w:r>
+        <w:t>1 Introducción</w:t>
+      </w:r>
+    </w:p>
+    <w:p>
+      <w:pPr>
+        <w:pStyle w:val="Ttulo2"/>
+        <w:spacing w:after="80"/>
+      </w:pPr>
+      <w:r>
+        <w:t>1.1 Propósito</w:t>
+      </w:r>
+    </w:p>
+    <w:p>
+      <w:pPr>
+        <w:spacing w:after="80"/>
+      </w:pPr>
+      <w:r>
+        <w:t>Definir los requisitos de la primera versión del sitio web de Clínica Aura, una clínica ficticia dedicada a la salud dental y la armonización facial. El documento está dirigido al equipo de desarrollo y al docente evaluador.</w:t>
+      </w:r>
+    </w:p>
+    <w:p>
+      <w:pPr>
+        <w:pStyle w:val="Ttulo2"/>
+        <w:spacing w:after="80"/>
+      </w:pPr>
+      <w:r>
+        <w:t>1.2 Alcance</w:t>
+      </w:r>
+    </w:p>
+    <w:p>
+      <w:pPr>
+        <w:spacing w:after="80"/>
+      </w:pPr>
+      <w:r>
+        <w:t>El sitio permite conocer la clínica, revisar tratamientos, consultar precios referenciales, preparar un pedido, registrar usuarios, iniciar sesión y enviar una solicitud de reserva. Los datos se almacenan solamente en el navegador.</w:t>
+      </w:r>
+    </w:p>
+    <w:p>
+      <w:pPr>
+        <w:pStyle w:val="Ttulo2"/>
+        <w:spacing w:after="80"/>
+      </w:pPr>
+      <w:r>
+        <w:t>1.3 Público objetivo</w:t>
+      </w:r>
+    </w:p>
+    <w:p>
+      <w:pPr>
+        <w:spacing w:after="80"/>
+      </w:pPr>
+      <w:r>
+        <w:t>Personas mayores de edad interesadas en servicios dentales o faciales que desean informarse, estimar tratamientos o solicitar una evaluación.</w:t>
+      </w:r>
+    </w:p>
+    <w:p>
+      <w:pPr>
+        <w:pStyle w:val="Ttulo1"/>
+        <w:spacing w:after="80"/>
+      </w:pPr>
+      <w:r>
+        <w:t>2 Requerimientos funcionales</w:t>
+      </w:r>
+    </w:p>
+    <w:tbl>
+      <w:tblPr>
+        <w:tblW w:type="auto" w:w="0"/>
+        <w:tblLayout w:type="fixed"/>
+        <w:tblLook w:firstColumn="1" w:firstRow="1" w:lastColumn="0" w:lastRow="0" w:noHBand="0" w:noVBand="1" w:val="04A0"/>
+      </w:tblPr>
+      <w:tblGrid>
+        <w:gridCol w:w="1224"/>
+        <w:gridCol w:w="8640"/>
+      </w:tblGrid>
+      <w:tr>
+        <w:tc>
+          <w:tcPr>
+            <w:tcW w:type="dxa" w:w="1224"/>
+            <w:shd w:fill="007C83"/>
+            <w:tcBorders>
+              <w:top w:val="single" w:sz="6" w:color="D9D9D9"/>
+              <w:left w:val="single" w:sz="6" w:color="D9D9D9"/>
+              <w:bottom w:val="single" w:sz="6" w:color="D9D9D9"/>
+              <w:right w:val="single" w:sz="6" w:color="D9D9D9"/>
+              <w:insideH w:val="single" w:sz="6" w:color="D9D9D9"/>
+              <w:insideV w:val="single" w:sz="6" w:color="D9D9D9"/>
+            </w:tcBorders>
+            <w:vAlign w:val="center"/>
+          </w:tcPr>
+          <w:p>
+            <w:r>
+              <w:rPr>
+                <w:b/>
+                <w:color w:val="FFFFFF"/>
+              </w:rPr>
+              <w:t>Código</w:t>
+            </w:r>
+          </w:p>
+        </w:tc>
+        <w:tc>
+          <w:tcPr>
+            <w:tcW w:type="dxa" w:w="8640"/>
+            <w:shd w:fill="007C83"/>
+            <w:tcBorders>
+              <w:top w:val="single" w:sz="6" w:color="D9D9D9"/>
+              <w:left w:val="single" w:sz="6" w:color="D9D9D9"/>
+              <w:bottom w:val="single" w:sz="6" w:color="D9D9D9"/>
+              <w:right w:val="single" w:sz="6" w:color="D9D9D9"/>
+              <w:insideH w:val="single" w:sz="6" w:color="D9D9D9"/>
+              <w:insideV w:val="single" w:sz="6" w:color="D9D9D9"/>
+            </w:tcBorders>
+            <w:vAlign w:val="center"/>
+          </w:tcPr>
+          <w:p>
+            <w:r>
+              <w:rPr>
+                <w:b/>
+                <w:color w:val="FFFFFF"/>
+              </w:rPr>
+              <w:t>Requerimiento</w:t>
+            </w:r>
+          </w:p>
+        </w:tc>
+      </w:tr>
+      <w:tr>
+        <w:tc>
+          <w:tcPr>
+            <w:tcW w:type="dxa" w:w="1224"/>
+            <w:tcBorders>
+              <w:top w:val="single" w:sz="6" w:color="D9D9D9"/>
+              <w:left w:val="single" w:sz="6" w:color="D9D9D9"/>
+              <w:bottom w:val="single" w:sz="6" w:color="D9D9D9"/>
+              <w:right w:val="single" w:sz="6" w:color="D9D9D9"/>
+              <w:insideH w:val="single" w:sz="6" w:color="D9D9D9"/>
+              <w:insideV w:val="single" w:sz="6" w:color="D9D9D9"/>
+            </w:tcBorders>
+            <w:vAlign w:val="center"/>
+          </w:tcPr>
+          <w:p>
+            <w:pPr>
+              <w:spacing w:after="60"/>
+            </w:pPr>
+            <w:r>
+              <w:rPr>
+                <w:sz w:val="17"/>
+              </w:rPr>
+              <w:t>RF-01</w:t>
+            </w:r>
+          </w:p>
+        </w:tc>
+        <w:tc>
+          <w:tcPr>
+            <w:tcW w:type="dxa" w:w="8640"/>
+            <w:tcBorders>
+              <w:top w:val="single" w:sz="6" w:color="D9D9D9"/>
+              <w:left w:val="single" w:sz="6" w:color="D9D9D9"/>
+              <w:bottom w:val="single" w:sz="6" w:color="D9D9D9"/>
+              <w:right w:val="single" w:sz="6" w:color="D9D9D9"/>
+              <w:insideH w:val="single" w:sz="6" w:color="D9D9D9"/>
+              <w:insideV w:val="single" w:sz="6" w:color="D9D9D9"/>
+            </w:tcBorders>
+            <w:vAlign w:val="center"/>
+          </w:tcPr>
+          <w:p>
+            <w:pPr>
+              <w:spacing w:after="60"/>
+            </w:pPr>
+            <w:r>
+              <w:rPr>
+                <w:sz w:val="17"/>
+              </w:rPr>
+              <w:t>El usuario podrá navegar entre Inicio, Nosotros, Tratamientos, Mi pedido, Reserva, Ingresar y Registro.</w:t>
+            </w:r>
+          </w:p>
+        </w:tc>
+      </w:tr>
+      <w:tr>
+        <w:tc>
+          <w:tcPr>
+            <w:tcW w:type="dxa" w:w="1224"/>
+            <w:shd w:fill="EAF6F6"/>
+            <w:tcBorders>
+              <w:top w:val="single" w:sz="6" w:color="D9D9D9"/>
+              <w:left w:val="single" w:sz="6" w:color="D9D9D9"/>
+              <w:bottom w:val="single" w:sz="6" w:color="D9D9D9"/>
+              <w:right w:val="single" w:sz="6" w:color="D9D9D9"/>
+              <w:insideH w:val="single" w:sz="6" w:color="D9D9D9"/>
+              <w:insideV w:val="single" w:sz="6" w:color="D9D9D9"/>
+            </w:tcBorders>
+            <w:vAlign w:val="center"/>
+          </w:tcPr>
+          <w:p>
+            <w:pPr>
+              <w:spacing w:after="60"/>
+            </w:pPr>
+            <w:r>
+              <w:rPr>
+                <w:sz w:val="17"/>
+              </w:rPr>
+              <w:t>RF-02</w:t>
+            </w:r>
+          </w:p>
+        </w:tc>
+        <w:tc>
+          <w:tcPr>
+            <w:tcW w:type="dxa" w:w="8640"/>
+            <w:shd w:fill="EAF6F6"/>
+            <w:tcBorders>
+              <w:top w:val="single" w:sz="6" w:color="D9D9D9"/>
+              <w:left w:val="single" w:sz="6" w:color="D9D9D9"/>
+              <w:bottom w:val="single" w:sz="6" w:color="D9D9D9"/>
+              <w:right w:val="single" w:sz="6" w:color="D9D9D9"/>
+              <w:insideH w:val="single" w:sz="6" w:color="D9D9D9"/>
+              <w:insideV w:val="single" w:sz="6" w:color="D9D9D9"/>
+            </w:tcBorders>
+            <w:vAlign w:val="center"/>
+          </w:tcPr>
+          <w:p>
+            <w:pPr>
+              <w:spacing w:after="60"/>
+            </w:pPr>
+            <w:r>
+              <w:rPr>
+                <w:sz w:val="17"/>
+              </w:rPr>
+              <w:t>El usuario podrá revisar tratamientos dentales, estéticos y faciales.</w:t>
+            </w:r>
+          </w:p>
+        </w:tc>
+      </w:tr>
+      <w:tr>
+        <w:tc>
+          <w:tcPr>
+            <w:tcW w:type="dxa" w:w="1224"/>
+            <w:tcBorders>
+              <w:top w:val="single" w:sz="6" w:color="D9D9D9"/>
+              <w:left w:val="single" w:sz="6" w:color="D9D9D9"/>
+              <w:bottom w:val="single" w:sz="6" w:color="D9D9D9"/>
+              <w:right w:val="single" w:sz="6" w:color="D9D9D9"/>
+              <w:insideH w:val="single" w:sz="6" w:color="D9D9D9"/>
+              <w:insideV w:val="single" w:sz="6" w:color="D9D9D9"/>
+            </w:tcBorders>
+            <w:vAlign w:val="center"/>
+          </w:tcPr>
+          <w:p>
+            <w:pPr>
+              <w:spacing w:after="60"/>
+            </w:pPr>
+            <w:r>
+              <w:rPr>
+                <w:sz w:val="17"/>
+              </w:rPr>
+              <w:t>RF-03</w:t>
+            </w:r>
+          </w:p>
+        </w:tc>
+        <w:tc>
+          <w:tcPr>
+            <w:tcW w:type="dxa" w:w="8640"/>
+            <w:tcBorders>
+              <w:top w:val="single" w:sz="6" w:color="D9D9D9"/>
+              <w:left w:val="single" w:sz="6" w:color="D9D9D9"/>
+              <w:bottom w:val="single" w:sz="6" w:color="D9D9D9"/>
+              <w:right w:val="single" w:sz="6" w:color="D9D9D9"/>
+              <w:insideH w:val="single" w:sz="6" w:color="D9D9D9"/>
+              <w:insideV w:val="single" w:sz="6" w:color="D9D9D9"/>
+            </w:tcBorders>
+            <w:vAlign w:val="center"/>
+          </w:tcPr>
+          <w:p>
+            <w:pPr>
+              <w:spacing w:after="60"/>
+            </w:pPr>
+            <w:r>
+              <w:rPr>
+                <w:sz w:val="17"/>
+              </w:rPr>
+              <w:t>El sitio mostrará imágenes, descripciones y precios referenciales de los tratamientos.</w:t>
+            </w:r>
+          </w:p>
+        </w:tc>
+      </w:tr>
+      <w:tr>
+        <w:tc>
+          <w:tcPr>
+            <w:tcW w:type="dxa" w:w="1224"/>
+            <w:shd w:fill="EAF6F6"/>
+            <w:tcBorders>
+              <w:top w:val="single" w:sz="6" w:color="D9D9D9"/>
+              <w:left w:val="single" w:sz="6" w:color="D9D9D9"/>
+              <w:bottom w:val="single" w:sz="6" w:color="D9D9D9"/>
+              <w:right w:val="single" w:sz="6" w:color="D9D9D9"/>
+              <w:insideH w:val="single" w:sz="6" w:color="D9D9D9"/>
+              <w:insideV w:val="single" w:sz="6" w:color="D9D9D9"/>
+            </w:tcBorders>
+            <w:vAlign w:val="center"/>
+          </w:tcPr>
+          <w:p>
+            <w:pPr>
+              <w:spacing w:after="60"/>
+            </w:pPr>
+            <w:r>
+              <w:rPr>
+                <w:sz w:val="17"/>
+              </w:rPr>
+              <w:t>RF-04</w:t>
+            </w:r>
+          </w:p>
+        </w:tc>
+        <w:tc>
+          <w:tcPr>
+            <w:tcW w:type="dxa" w:w="8640"/>
+            <w:shd w:fill="EAF6F6"/>
+            <w:tcBorders>
+              <w:top w:val="single" w:sz="6" w:color="D9D9D9"/>
+              <w:left w:val="single" w:sz="6" w:color="D9D9D9"/>
+              <w:bottom w:val="single" w:sz="6" w:color="D9D9D9"/>
+              <w:right w:val="single" w:sz="6" w:color="D9D9D9"/>
+              <w:insideH w:val="single" w:sz="6" w:color="D9D9D9"/>
+              <w:insideV w:val="single" w:sz="6" w:color="D9D9D9"/>
+            </w:tcBorders>
+            <w:vAlign w:val="center"/>
+          </w:tcPr>
+          <w:p>
+            <w:pPr>
+              <w:spacing w:after="60"/>
+            </w:pPr>
+            <w:r>
+              <w:rPr>
+                <w:sz w:val="17"/>
+              </w:rPr>
+              <w:t>El usuario podrá reproducir un video educativo desde la página de inicio.</w:t>
+            </w:r>
+          </w:p>
+        </w:tc>
+      </w:tr>
+      <w:tr>
+        <w:tc>
+          <w:tcPr>
+            <w:tcW w:type="dxa" w:w="1224"/>
+            <w:tcBorders>
+              <w:top w:val="single" w:sz="6" w:color="D9D9D9"/>
+              <w:left w:val="single" w:sz="6" w:color="D9D9D9"/>
+              <w:bottom w:val="single" w:sz="6" w:color="D9D9D9"/>
+              <w:right w:val="single" w:sz="6" w:color="D9D9D9"/>
+              <w:insideH w:val="single" w:sz="6" w:color="D9D9D9"/>
+              <w:insideV w:val="single" w:sz="6" w:color="D9D9D9"/>
+            </w:tcBorders>
+            <w:vAlign w:val="center"/>
+          </w:tcPr>
+          <w:p>
+            <w:pPr>
+              <w:spacing w:after="60"/>
+            </w:pPr>
+            <w:r>
+              <w:rPr>
+                <w:sz w:val="17"/>
+              </w:rPr>
+              <w:t>RF-05</w:t>
+            </w:r>
+          </w:p>
+        </w:tc>
+        <w:tc>
+          <w:tcPr>
+            <w:tcW w:type="dxa" w:w="8640"/>
+            <w:tcBorders>
+              <w:top w:val="single" w:sz="6" w:color="D9D9D9"/>
+              <w:left w:val="single" w:sz="6" w:color="D9D9D9"/>
+              <w:bottom w:val="single" w:sz="6" w:color="D9D9D9"/>
+              <w:right w:val="single" w:sz="6" w:color="D9D9D9"/>
+              <w:insideH w:val="single" w:sz="6" w:color="D9D9D9"/>
+              <w:insideV w:val="single" w:sz="6" w:color="D9D9D9"/>
+            </w:tcBorders>
+            <w:vAlign w:val="center"/>
+          </w:tcPr>
+          <w:p>
+            <w:pPr>
+              <w:spacing w:after="60"/>
+            </w:pPr>
+            <w:r>
+              <w:rPr>
+                <w:sz w:val="17"/>
+              </w:rPr>
+              <w:t>El usuario podrá completar un formulario para solicitar una reserva.</w:t>
+            </w:r>
+          </w:p>
+        </w:tc>
+      </w:tr>
+      <w:tr>
+        <w:tc>
+          <w:tcPr>
+            <w:tcW w:type="dxa" w:w="1224"/>
+            <w:shd w:fill="EAF6F6"/>
+            <w:tcBorders>
+              <w:top w:val="single" w:sz="6" w:color="D9D9D9"/>
+              <w:left w:val="single" w:sz="6" w:color="D9D9D9"/>
+              <w:bottom w:val="single" w:sz="6" w:color="D9D9D9"/>
+              <w:right w:val="single" w:sz="6" w:color="D9D9D9"/>
+              <w:insideH w:val="single" w:sz="6" w:color="D9D9D9"/>
+              <w:insideV w:val="single" w:sz="6" w:color="D9D9D9"/>
+            </w:tcBorders>
+            <w:vAlign w:val="center"/>
+          </w:tcPr>
+          <w:p>
+            <w:pPr>
+              <w:spacing w:after="60"/>
+            </w:pPr>
+            <w:r>
+              <w:rPr>
+                <w:sz w:val="17"/>
+              </w:rPr>
+              <w:t>RF-06</w:t>
+            </w:r>
+          </w:p>
+        </w:tc>
+        <w:tc>
+          <w:tcPr>
+            <w:tcW w:type="dxa" w:w="8640"/>
+            <w:shd w:fill="EAF6F6"/>
+            <w:tcBorders>
+              <w:top w:val="single" w:sz="6" w:color="D9D9D9"/>
+              <w:left w:val="single" w:sz="6" w:color="D9D9D9"/>
+              <w:bottom w:val="single" w:sz="6" w:color="D9D9D9"/>
+              <w:right w:val="single" w:sz="6" w:color="D9D9D9"/>
+              <w:insideH w:val="single" w:sz="6" w:color="D9D9D9"/>
+              <w:insideV w:val="single" w:sz="6" w:color="D9D9D9"/>
+            </w:tcBorders>
+            <w:vAlign w:val="center"/>
+          </w:tcPr>
+          <w:p>
+            <w:pPr>
+              <w:spacing w:after="60"/>
+            </w:pPr>
+            <w:r>
+              <w:rPr>
+                <w:sz w:val="17"/>
+              </w:rPr>
+              <w:t>JavaScript validará nombre, RUT, correo y servicio en el formulario de reserva.</w:t>
+            </w:r>
+          </w:p>
+        </w:tc>
+      </w:tr>
+      <w:tr>
+        <w:tc>
+          <w:tcPr>
+            <w:tcW w:type="dxa" w:w="1224"/>
+            <w:tcBorders>
+              <w:top w:val="single" w:sz="6" w:color="D9D9D9"/>
+              <w:left w:val="single" w:sz="6" w:color="D9D9D9"/>
+              <w:bottom w:val="single" w:sz="6" w:color="D9D9D9"/>
+              <w:right w:val="single" w:sz="6" w:color="D9D9D9"/>
+              <w:insideH w:val="single" w:sz="6" w:color="D9D9D9"/>
+              <w:insideV w:val="single" w:sz="6" w:color="D9D9D9"/>
+            </w:tcBorders>
+            <w:vAlign w:val="center"/>
+          </w:tcPr>
+          <w:p>
+            <w:pPr>
+              <w:spacing w:after="60"/>
+            </w:pPr>
+            <w:r>
+              <w:rPr>
+                <w:sz w:val="17"/>
+              </w:rPr>
+              <w:t>RF-07</w:t>
+            </w:r>
+          </w:p>
+        </w:tc>
+        <w:tc>
+          <w:tcPr>
+            <w:tcW w:type="dxa" w:w="8640"/>
+            <w:tcBorders>
+              <w:top w:val="single" w:sz="6" w:color="D9D9D9"/>
+              <w:left w:val="single" w:sz="6" w:color="D9D9D9"/>
+              <w:bottom w:val="single" w:sz="6" w:color="D9D9D9"/>
+              <w:right w:val="single" w:sz="6" w:color="D9D9D9"/>
+              <w:insideH w:val="single" w:sz="6" w:color="D9D9D9"/>
+              <w:insideV w:val="single" w:sz="6" w:color="D9D9D9"/>
+            </w:tcBorders>
+            <w:vAlign w:val="center"/>
+          </w:tcPr>
+          <w:p>
+            <w:pPr>
+              <w:spacing w:after="60"/>
+            </w:pPr>
+            <w:r>
+              <w:rPr>
+                <w:sz w:val="17"/>
+              </w:rPr>
+              <w:t>El sistema mostrará mensajes específicos junto a los campos incorrectos y confirmará los datos válidos.</w:t>
+            </w:r>
+          </w:p>
+        </w:tc>
+      </w:tr>
+      <w:tr>
+        <w:tc>
+          <w:tcPr>
+            <w:tcW w:type="dxa" w:w="1224"/>
+            <w:shd w:fill="EAF6F6"/>
+            <w:tcBorders>
+              <w:top w:val="single" w:sz="6" w:color="D9D9D9"/>
+              <w:left w:val="single" w:sz="6" w:color="D9D9D9"/>
+              <w:bottom w:val="single" w:sz="6" w:color="D9D9D9"/>
+              <w:right w:val="single" w:sz="6" w:color="D9D9D9"/>
+              <w:insideH w:val="single" w:sz="6" w:color="D9D9D9"/>
+              <w:insideV w:val="single" w:sz="6" w:color="D9D9D9"/>
+            </w:tcBorders>
+            <w:vAlign w:val="center"/>
+          </w:tcPr>
+          <w:p>
+            <w:pPr>
+              <w:spacing w:after="60"/>
+            </w:pPr>
+            <w:r>
+              <w:rPr>
+                <w:sz w:val="17"/>
+              </w:rPr>
+              <w:t>RF-08</w:t>
+            </w:r>
+          </w:p>
+        </w:tc>
+        <w:tc>
+          <w:tcPr>
+            <w:tcW w:type="dxa" w:w="8640"/>
+            <w:shd w:fill="EAF6F6"/>
+            <w:tcBorders>
+              <w:top w:val="single" w:sz="6" w:color="D9D9D9"/>
+              <w:left w:val="single" w:sz="6" w:color="D9D9D9"/>
+              <w:bottom w:val="single" w:sz="6" w:color="D9D9D9"/>
+              <w:right w:val="single" w:sz="6" w:color="D9D9D9"/>
+              <w:insideH w:val="single" w:sz="6" w:color="D9D9D9"/>
+              <w:insideV w:val="single" w:sz="6" w:color="D9D9D9"/>
+            </w:tcBorders>
+            <w:vAlign w:val="center"/>
+          </w:tcPr>
+          <w:p>
+            <w:pPr>
+              <w:spacing w:after="60"/>
+            </w:pPr>
+            <w:r>
+              <w:rPr>
+                <w:sz w:val="17"/>
+              </w:rPr>
+              <w:t>El botón Limpiar eliminará los datos, mensajes e indicadores visuales del formulario.</w:t>
+            </w:r>
+          </w:p>
+        </w:tc>
+      </w:tr>
+      <w:tr>
+        <w:tc>
+          <w:tcPr>
+            <w:tcW w:type="dxa" w:w="1224"/>
+            <w:tcBorders>
+              <w:top w:val="single" w:sz="6" w:color="D9D9D9"/>
+              <w:left w:val="single" w:sz="6" w:color="D9D9D9"/>
+              <w:bottom w:val="single" w:sz="6" w:color="D9D9D9"/>
+              <w:right w:val="single" w:sz="6" w:color="D9D9D9"/>
+              <w:insideH w:val="single" w:sz="6" w:color="D9D9D9"/>
+              <w:insideV w:val="single" w:sz="6" w:color="D9D9D9"/>
+            </w:tcBorders>
+            <w:vAlign w:val="center"/>
+          </w:tcPr>
+          <w:p>
+            <w:pPr>
+              <w:spacing w:after="60"/>
+            </w:pPr>
+            <w:r>
+              <w:rPr>
+                <w:sz w:val="17"/>
+              </w:rPr>
+              <w:t>RF-09</w:t>
+            </w:r>
+          </w:p>
+        </w:tc>
+        <w:tc>
+          <w:tcPr>
+            <w:tcW w:type="dxa" w:w="8640"/>
+            <w:tcBorders>
+              <w:top w:val="single" w:sz="6" w:color="D9D9D9"/>
+              <w:left w:val="single" w:sz="6" w:color="D9D9D9"/>
+              <w:bottom w:val="single" w:sz="6" w:color="D9D9D9"/>
+              <w:right w:val="single" w:sz="6" w:color="D9D9D9"/>
+              <w:insideH w:val="single" w:sz="6" w:color="D9D9D9"/>
+              <w:insideV w:val="single" w:sz="6" w:color="D9D9D9"/>
+            </w:tcBorders>
+            <w:vAlign w:val="center"/>
+          </w:tcPr>
+          <w:p>
+            <w:pPr>
+              <w:spacing w:after="60"/>
+            </w:pPr>
+            <w:r>
+              <w:rPr>
+                <w:sz w:val="17"/>
+              </w:rPr>
+              <w:t>JavaScript generará el catálogo desde un arreglo de tratamientos.</w:t>
+            </w:r>
+          </w:p>
+        </w:tc>
+      </w:tr>
+      <w:tr>
+        <w:tc>
+          <w:tcPr>
+            <w:tcW w:type="dxa" w:w="1224"/>
+            <w:shd w:fill="EAF6F6"/>
+            <w:tcBorders>
+              <w:top w:val="single" w:sz="6" w:color="D9D9D9"/>
+              <w:left w:val="single" w:sz="6" w:color="D9D9D9"/>
+              <w:bottom w:val="single" w:sz="6" w:color="D9D9D9"/>
+              <w:right w:val="single" w:sz="6" w:color="D9D9D9"/>
+              <w:insideH w:val="single" w:sz="6" w:color="D9D9D9"/>
+              <w:insideV w:val="single" w:sz="6" w:color="D9D9D9"/>
+            </w:tcBorders>
+            <w:vAlign w:val="center"/>
+          </w:tcPr>
+          <w:p>
+            <w:pPr>
+              <w:spacing w:after="60"/>
+            </w:pPr>
+            <w:r>
+              <w:rPr>
+                <w:sz w:val="17"/>
+              </w:rPr>
+              <w:t>RF-10</w:t>
+            </w:r>
+          </w:p>
+        </w:tc>
+        <w:tc>
+          <w:tcPr>
+            <w:tcW w:type="dxa" w:w="8640"/>
+            <w:shd w:fill="EAF6F6"/>
+            <w:tcBorders>
+              <w:top w:val="single" w:sz="6" w:color="D9D9D9"/>
+              <w:left w:val="single" w:sz="6" w:color="D9D9D9"/>
+              <w:bottom w:val="single" w:sz="6" w:color="D9D9D9"/>
+              <w:right w:val="single" w:sz="6" w:color="D9D9D9"/>
+              <w:insideH w:val="single" w:sz="6" w:color="D9D9D9"/>
+              <w:insideV w:val="single" w:sz="6" w:color="D9D9D9"/>
+            </w:tcBorders>
+            <w:vAlign w:val="center"/>
+          </w:tcPr>
+          <w:p>
+            <w:pPr>
+              <w:spacing w:after="60"/>
+            </w:pPr>
+            <w:r>
+              <w:rPr>
+                <w:sz w:val="17"/>
+              </w:rPr>
+              <w:t>El usuario podrá agregar tratamientos al carrito, revisar cantidades, subtotales y total, y eliminar elementos.</w:t>
+            </w:r>
+          </w:p>
+        </w:tc>
+      </w:tr>
+      <w:tr>
+        <w:tc>
+          <w:tcPr>
+            <w:tcW w:type="dxa" w:w="1224"/>
+            <w:tcBorders>
+              <w:top w:val="single" w:sz="6" w:color="D9D9D9"/>
+              <w:left w:val="single" w:sz="6" w:color="D9D9D9"/>
+              <w:bottom w:val="single" w:sz="6" w:color="D9D9D9"/>
+              <w:right w:val="single" w:sz="6" w:color="D9D9D9"/>
+              <w:insideH w:val="single" w:sz="6" w:color="D9D9D9"/>
+              <w:insideV w:val="single" w:sz="6" w:color="D9D9D9"/>
+            </w:tcBorders>
+            <w:vAlign w:val="center"/>
+          </w:tcPr>
+          <w:p>
+            <w:pPr>
+              <w:spacing w:after="60"/>
+            </w:pPr>
+            <w:r>
+              <w:rPr>
+                <w:sz w:val="17"/>
+              </w:rPr>
+              <w:t>RF-11</w:t>
+            </w:r>
+          </w:p>
+        </w:tc>
+        <w:tc>
+          <w:tcPr>
+            <w:tcW w:type="dxa" w:w="8640"/>
+            <w:tcBorders>
+              <w:top w:val="single" w:sz="6" w:color="D9D9D9"/>
+              <w:left w:val="single" w:sz="6" w:color="D9D9D9"/>
+              <w:bottom w:val="single" w:sz="6" w:color="D9D9D9"/>
+              <w:right w:val="single" w:sz="6" w:color="D9D9D9"/>
+              <w:insideH w:val="single" w:sz="6" w:color="D9D9D9"/>
+              <w:insideV w:val="single" w:sz="6" w:color="D9D9D9"/>
+            </w:tcBorders>
+            <w:vAlign w:val="center"/>
+          </w:tcPr>
+          <w:p>
+            <w:pPr>
+              <w:spacing w:after="60"/>
+            </w:pPr>
+            <w:r>
+              <w:rPr>
+                <w:sz w:val="17"/>
+              </w:rPr>
+              <w:t>El carrito se conservará en el navegador mediante localStorage.</w:t>
+            </w:r>
+          </w:p>
+        </w:tc>
+      </w:tr>
+      <w:tr>
+        <w:tc>
+          <w:tcPr>
+            <w:tcW w:type="dxa" w:w="1224"/>
+            <w:shd w:fill="EAF6F6"/>
+            <w:tcBorders>
+              <w:top w:val="single" w:sz="6" w:color="D9D9D9"/>
+              <w:left w:val="single" w:sz="6" w:color="D9D9D9"/>
+              <w:bottom w:val="single" w:sz="6" w:color="D9D9D9"/>
+              <w:right w:val="single" w:sz="6" w:color="D9D9D9"/>
+              <w:insideH w:val="single" w:sz="6" w:color="D9D9D9"/>
+              <w:insideV w:val="single" w:sz="6" w:color="D9D9D9"/>
+            </w:tcBorders>
+            <w:vAlign w:val="center"/>
+          </w:tcPr>
+          <w:p>
+            <w:pPr>
+              <w:spacing w:after="60"/>
+            </w:pPr>
+            <w:r>
+              <w:rPr>
+                <w:sz w:val="17"/>
+              </w:rPr>
+              <w:t>RF-12</w:t>
+            </w:r>
+          </w:p>
+        </w:tc>
+        <w:tc>
+          <w:tcPr>
+            <w:tcW w:type="dxa" w:w="8640"/>
+            <w:shd w:fill="EAF6F6"/>
+            <w:tcBorders>
+              <w:top w:val="single" w:sz="6" w:color="D9D9D9"/>
+              <w:left w:val="single" w:sz="6" w:color="D9D9D9"/>
+              <w:bottom w:val="single" w:sz="6" w:color="D9D9D9"/>
+              <w:right w:val="single" w:sz="6" w:color="D9D9D9"/>
+              <w:insideH w:val="single" w:sz="6" w:color="D9D9D9"/>
+              <w:insideV w:val="single" w:sz="6" w:color="D9D9D9"/>
+            </w:tcBorders>
+            <w:vAlign w:val="center"/>
+          </w:tcPr>
+          <w:p>
+            <w:pPr>
+              <w:spacing w:after="60"/>
+            </w:pPr>
+            <w:r>
+              <w:rPr>
+                <w:sz w:val="17"/>
+              </w:rPr>
+              <w:t>El usuario podrá registrarse con RUN válido sin puntos ni guion, nombre, apellidos, correo, contraseña, región, comuna y dirección.</w:t>
+            </w:r>
+          </w:p>
+        </w:tc>
+      </w:tr>
+      <w:tr>
+        <w:tc>
+          <w:tcPr>
+            <w:tcW w:type="dxa" w:w="1224"/>
+            <w:tcBorders>
+              <w:top w:val="single" w:sz="6" w:color="D9D9D9"/>
+              <w:left w:val="single" w:sz="6" w:color="D9D9D9"/>
+              <w:bottom w:val="single" w:sz="6" w:color="D9D9D9"/>
+              <w:right w:val="single" w:sz="6" w:color="D9D9D9"/>
+              <w:insideH w:val="single" w:sz="6" w:color="D9D9D9"/>
+              <w:insideV w:val="single" w:sz="6" w:color="D9D9D9"/>
+            </w:tcBorders>
+            <w:vAlign w:val="center"/>
+          </w:tcPr>
+          <w:p>
+            <w:pPr>
+              <w:spacing w:after="60"/>
+            </w:pPr>
+            <w:r>
+              <w:rPr>
+                <w:sz w:val="17"/>
+              </w:rPr>
+              <w:t>RF-13</w:t>
+            </w:r>
+          </w:p>
+        </w:tc>
+        <w:tc>
+          <w:tcPr>
+            <w:tcW w:type="dxa" w:w="8640"/>
+            <w:tcBorders>
+              <w:top w:val="single" w:sz="6" w:color="D9D9D9"/>
+              <w:left w:val="single" w:sz="6" w:color="D9D9D9"/>
+              <w:bottom w:val="single" w:sz="6" w:color="D9D9D9"/>
+              <w:right w:val="single" w:sz="6" w:color="D9D9D9"/>
+              <w:insideH w:val="single" w:sz="6" w:color="D9D9D9"/>
+              <w:insideV w:val="single" w:sz="6" w:color="D9D9D9"/>
+            </w:tcBorders>
+            <w:vAlign w:val="center"/>
+          </w:tcPr>
+          <w:p>
+            <w:pPr>
+              <w:spacing w:after="60"/>
+            </w:pPr>
+            <w:r>
+              <w:rPr>
+                <w:sz w:val="17"/>
+              </w:rPr>
+              <w:t>El registro aceptará solamente correos @duoc.cl, @profesor.duoc.cl y @gmail.com, y contraseñas de 4 a 10 caracteres.</w:t>
+            </w:r>
+          </w:p>
+        </w:tc>
+      </w:tr>
+      <w:tr>
+        <w:tc>
+          <w:tcPr>
+            <w:tcW w:type="dxa" w:w="1224"/>
+            <w:shd w:fill="EAF6F6"/>
+            <w:tcBorders>
+              <w:top w:val="single" w:sz="6" w:color="D9D9D9"/>
+              <w:left w:val="single" w:sz="6" w:color="D9D9D9"/>
+              <w:bottom w:val="single" w:sz="6" w:color="D9D9D9"/>
+              <w:right w:val="single" w:sz="6" w:color="D9D9D9"/>
+              <w:insideH w:val="single" w:sz="6" w:color="D9D9D9"/>
+              <w:insideV w:val="single" w:sz="6" w:color="D9D9D9"/>
+            </w:tcBorders>
+            <w:vAlign w:val="center"/>
+          </w:tcPr>
+          <w:p>
+            <w:pPr>
+              <w:spacing w:after="60"/>
+            </w:pPr>
+            <w:r>
+              <w:rPr>
+                <w:sz w:val="17"/>
+              </w:rPr>
+              <w:t>RF-14</w:t>
+            </w:r>
+          </w:p>
+        </w:tc>
+        <w:tc>
+          <w:tcPr>
+            <w:tcW w:type="dxa" w:w="8640"/>
+            <w:shd w:fill="EAF6F6"/>
+            <w:tcBorders>
+              <w:top w:val="single" w:sz="6" w:color="D9D9D9"/>
+              <w:left w:val="single" w:sz="6" w:color="D9D9D9"/>
+              <w:bottom w:val="single" w:sz="6" w:color="D9D9D9"/>
+              <w:right w:val="single" w:sz="6" w:color="D9D9D9"/>
+              <w:insideH w:val="single" w:sz="6" w:color="D9D9D9"/>
+              <w:insideV w:val="single" w:sz="6" w:color="D9D9D9"/>
+            </w:tcBorders>
+            <w:vAlign w:val="center"/>
+          </w:tcPr>
+          <w:p>
+            <w:pPr>
+              <w:spacing w:after="60"/>
+            </w:pPr>
+            <w:r>
+              <w:rPr>
+                <w:sz w:val="17"/>
+              </w:rPr>
+              <w:t>El usuario registrado podrá iniciar sesión con su correo y contraseña; la sesión se guardará en localStorage.</w:t>
+            </w:r>
+          </w:p>
+        </w:tc>
+      </w:tr>
+    </w:tbl>
+    <w:p>
+      <w:pPr>
+        <w:spacing w:after="80"/>
+      </w:pPr>
+    </w:p>
+    <w:p>
+      <w:pPr>
+        <w:pStyle w:val="Ttulo1"/>
+        <w:spacing w:after="80"/>
+      </w:pPr>
+      <w:r>
+        <w:t>3 Requerimientos no funcionales</w:t>
+      </w:r>
+    </w:p>
+    <w:tbl>
+      <w:tblPr>
+        <w:tblW w:type="auto" w:w="0"/>
+        <w:tblLayout w:type="fixed"/>
+        <w:tblLook w:firstColumn="1" w:firstRow="1" w:lastColumn="0" w:lastRow="0" w:noHBand="0" w:noVBand="1" w:val="04A0"/>
+      </w:tblPr>
+      <w:tblGrid>
+        <w:gridCol w:w="1224"/>
+        <w:gridCol w:w="8640"/>
+      </w:tblGrid>
+      <w:tr>
+        <w:tc>
+          <w:tcPr>
+            <w:tcW w:type="dxa" w:w="1224"/>
+            <w:shd w:fill="007C83"/>
+            <w:tcBorders>
+              <w:top w:val="single" w:sz="6" w:color="D9D9D9"/>
+              <w:left w:val="single" w:sz="6" w:color="D9D9D9"/>
+              <w:bottom w:val="single" w:sz="6" w:color="D9D9D9"/>
+              <w:right w:val="single" w:sz="6" w:color="D9D9D9"/>
+              <w:insideH w:val="single" w:sz="6" w:color="D9D9D9"/>
+              <w:insideV w:val="single" w:sz="6" w:color="D9D9D9"/>
+            </w:tcBorders>
+            <w:vAlign w:val="center"/>
+          </w:tcPr>
+          <w:p>
+            <w:r>
+              <w:rPr>
+                <w:b/>
+                <w:color w:val="FFFFFF"/>
+              </w:rPr>
+              <w:t>Código</w:t>
+            </w:r>
+          </w:p>
+        </w:tc>
+        <w:tc>
+          <w:tcPr>
+            <w:tcW w:type="dxa" w:w="8640"/>
+            <w:shd w:fill="007C83"/>
+            <w:tcBorders>
+              <w:top w:val="single" w:sz="6" w:color="D9D9D9"/>
+              <w:left w:val="single" w:sz="6" w:color="D9D9D9"/>
+              <w:bottom w:val="single" w:sz="6" w:color="D9D9D9"/>
+              <w:right w:val="single" w:sz="6" w:color="D9D9D9"/>
+              <w:insideH w:val="single" w:sz="6" w:color="D9D9D9"/>
+              <w:insideV w:val="single" w:sz="6" w:color="D9D9D9"/>
+            </w:tcBorders>
+            <w:vAlign w:val="center"/>
+          </w:tcPr>
+          <w:p>
+            <w:r>
+              <w:rPr>
+                <w:b/>
+                <w:color w:val="FFFFFF"/>
+              </w:rPr>
+              <w:t>Requerimiento</w:t>
+            </w:r>
+          </w:p>
+        </w:tc>
+      </w:tr>
+      <w:tr>
+        <w:tc>
+          <w:tcPr>
+            <w:tcW w:type="dxa" w:w="1224"/>
+            <w:tcBorders>
+              <w:top w:val="single" w:sz="6" w:color="D9D9D9"/>
+              <w:left w:val="single" w:sz="6" w:color="D9D9D9"/>
+              <w:bottom w:val="single" w:sz="6" w:color="D9D9D9"/>
+              <w:right w:val="single" w:sz="6" w:color="D9D9D9"/>
+              <w:insideH w:val="single" w:sz="6" w:color="D9D9D9"/>
+              <w:insideV w:val="single" w:sz="6" w:color="D9D9D9"/>
+            </w:tcBorders>
+            <w:vAlign w:val="center"/>
+          </w:tcPr>
+          <w:p>
+            <w:pPr>
+              <w:spacing w:after="60"/>
+            </w:pPr>
+            <w:r>
+              <w:rPr>
+                <w:sz w:val="17"/>
+              </w:rPr>
+              <w:t>RNF-01</w:t>
+            </w:r>
+          </w:p>
+        </w:tc>
+        <w:tc>
+          <w:tcPr>
+            <w:tcW w:type="dxa" w:w="8640"/>
+            <w:tcBorders>
+              <w:top w:val="single" w:sz="6" w:color="D9D9D9"/>
+              <w:left w:val="single" w:sz="6" w:color="D9D9D9"/>
+              <w:bottom w:val="single" w:sz="6" w:color="D9D9D9"/>
+              <w:right w:val="single" w:sz="6" w:color="D9D9D9"/>
+              <w:insideH w:val="single" w:sz="6" w:color="D9D9D9"/>
+              <w:insideV w:val="single" w:sz="6" w:color="D9D9D9"/>
+            </w:tcBorders>
+            <w:vAlign w:val="center"/>
+          </w:tcPr>
+          <w:p>
+            <w:pPr>
+              <w:spacing w:after="60"/>
+            </w:pPr>
+            <w:r>
+              <w:rPr>
+                <w:sz w:val="17"/>
+              </w:rPr>
+              <w:t>El sitio utilizará estructura semántica HTML5.</w:t>
+            </w:r>
+          </w:p>
+        </w:tc>
+      </w:tr>
+      <w:tr>
+        <w:tc>
+          <w:tcPr>
+            <w:tcW w:type="dxa" w:w="1224"/>
+            <w:shd w:fill="EAF6F6"/>
+            <w:tcBorders>
+              <w:top w:val="single" w:sz="6" w:color="D9D9D9"/>
+              <w:left w:val="single" w:sz="6" w:color="D9D9D9"/>
+              <w:bottom w:val="single" w:sz="6" w:color="D9D9D9"/>
+              <w:right w:val="single" w:sz="6" w:color="D9D9D9"/>
+              <w:insideH w:val="single" w:sz="6" w:color="D9D9D9"/>
+              <w:insideV w:val="single" w:sz="6" w:color="D9D9D9"/>
+            </w:tcBorders>
+            <w:vAlign w:val="center"/>
+          </w:tcPr>
+          <w:p>
+            <w:pPr>
+              <w:spacing w:after="60"/>
+            </w:pPr>
+            <w:r>
+              <w:rPr>
+                <w:sz w:val="17"/>
+              </w:rPr>
+              <w:t>RNF-02</w:t>
+            </w:r>
+          </w:p>
+        </w:tc>
+        <w:tc>
+          <w:tcPr>
+            <w:tcW w:type="dxa" w:w="8640"/>
+            <w:shd w:fill="EAF6F6"/>
+            <w:tcBorders>
+              <w:top w:val="single" w:sz="6" w:color="D9D9D9"/>
+              <w:left w:val="single" w:sz="6" w:color="D9D9D9"/>
+              <w:bottom w:val="single" w:sz="6" w:color="D9D9D9"/>
+              <w:right w:val="single" w:sz="6" w:color="D9D9D9"/>
+              <w:insideH w:val="single" w:sz="6" w:color="D9D9D9"/>
+              <w:insideV w:val="single" w:sz="6" w:color="D9D9D9"/>
+            </w:tcBorders>
+            <w:vAlign w:val="center"/>
+          </w:tcPr>
+          <w:p>
+            <w:pPr>
+              <w:spacing w:after="60"/>
+            </w:pPr>
+            <w:r>
+              <w:rPr>
+                <w:sz w:val="17"/>
+              </w:rPr>
+              <w:t>Los estilos estarán centralizados en una hoja CSS externa.</w:t>
+            </w:r>
+          </w:p>
+        </w:tc>
+      </w:tr>
+      <w:tr>
+        <w:tc>
+          <w:tcPr>
+            <w:tcW w:type="dxa" w:w="1224"/>
+            <w:tcBorders>
+              <w:top w:val="single" w:sz="6" w:color="D9D9D9"/>
+              <w:left w:val="single" w:sz="6" w:color="D9D9D9"/>
+              <w:bottom w:val="single" w:sz="6" w:color="D9D9D9"/>
+              <w:right w:val="single" w:sz="6" w:color="D9D9D9"/>
+              <w:insideH w:val="single" w:sz="6" w:color="D9D9D9"/>
+              <w:insideV w:val="single" w:sz="6" w:color="D9D9D9"/>
+            </w:tcBorders>
+            <w:vAlign w:val="center"/>
+          </w:tcPr>
+          <w:p>
+            <w:pPr>
+              <w:spacing w:after="60"/>
+            </w:pPr>
+            <w:r>
+              <w:rPr>
+                <w:sz w:val="17"/>
+              </w:rPr>
+              <w:t>RNF-03</w:t>
+            </w:r>
+          </w:p>
+        </w:tc>
+        <w:tc>
+          <w:tcPr>
+            <w:tcW w:type="dxa" w:w="8640"/>
+            <w:tcBorders>
+              <w:top w:val="single" w:sz="6" w:color="D9D9D9"/>
+              <w:left w:val="single" w:sz="6" w:color="D9D9D9"/>
+              <w:bottom w:val="single" w:sz="6" w:color="D9D9D9"/>
+              <w:right w:val="single" w:sz="6" w:color="D9D9D9"/>
+              <w:insideH w:val="single" w:sz="6" w:color="D9D9D9"/>
+              <w:insideV w:val="single" w:sz="6" w:color="D9D9D9"/>
+            </w:tcBorders>
+            <w:vAlign w:val="center"/>
+          </w:tcPr>
+          <w:p>
+            <w:pPr>
+              <w:spacing w:after="60"/>
+            </w:pPr>
+            <w:r>
+              <w:rPr>
+                <w:sz w:val="17"/>
+              </w:rPr>
+              <w:t>La interacción y las validaciones estarán en archivos JavaScript externos.</w:t>
+            </w:r>
+          </w:p>
+        </w:tc>
+      </w:tr>
+      <w:tr>
+        <w:tc>
+          <w:tcPr>
+            <w:tcW w:type="dxa" w:w="1224"/>
+            <w:shd w:fill="EAF6F6"/>
+            <w:tcBorders>
+              <w:top w:val="single" w:sz="6" w:color="D9D9D9"/>
+              <w:left w:val="single" w:sz="6" w:color="D9D9D9"/>
+              <w:bottom w:val="single" w:sz="6" w:color="D9D9D9"/>
+              <w:right w:val="single" w:sz="6" w:color="D9D9D9"/>
+              <w:insideH w:val="single" w:sz="6" w:color="D9D9D9"/>
+              <w:insideV w:val="single" w:sz="6" w:color="D9D9D9"/>
+            </w:tcBorders>
+            <w:vAlign w:val="center"/>
+          </w:tcPr>
+          <w:p>
+            <w:pPr>
+              <w:spacing w:after="60"/>
+            </w:pPr>
+            <w:r>
+              <w:rPr>
+                <w:sz w:val="17"/>
+              </w:rPr>
+              <w:t>RNF-04</w:t>
+            </w:r>
+          </w:p>
+        </w:tc>
+        <w:tc>
+          <w:tcPr>
+            <w:tcW w:type="dxa" w:w="8640"/>
+            <w:shd w:fill="EAF6F6"/>
+            <w:tcBorders>
+              <w:top w:val="single" w:sz="6" w:color="D9D9D9"/>
+              <w:left w:val="single" w:sz="6" w:color="D9D9D9"/>
+              <w:bottom w:val="single" w:sz="6" w:color="D9D9D9"/>
+              <w:right w:val="single" w:sz="6" w:color="D9D9D9"/>
+              <w:insideH w:val="single" w:sz="6" w:color="D9D9D9"/>
+              <w:insideV w:val="single" w:sz="6" w:color="D9D9D9"/>
+            </w:tcBorders>
+            <w:vAlign w:val="center"/>
+          </w:tcPr>
+          <w:p>
+            <w:pPr>
+              <w:spacing w:after="60"/>
+            </w:pPr>
+            <w:r>
+              <w:rPr>
+                <w:sz w:val="17"/>
+              </w:rPr>
+              <w:t>El diseño se adaptará a computadores, tablets y teléfonos mediante reglas responsivas.</w:t>
+            </w:r>
+          </w:p>
+        </w:tc>
+      </w:tr>
+      <w:tr>
+        <w:tc>
+          <w:tcPr>
+            <w:tcW w:type="dxa" w:w="1224"/>
+            <w:tcBorders>
+              <w:top w:val="single" w:sz="6" w:color="D9D9D9"/>
+              <w:left w:val="single" w:sz="6" w:color="D9D9D9"/>
+              <w:bottom w:val="single" w:sz="6" w:color="D9D9D9"/>
+              <w:right w:val="single" w:sz="6" w:color="D9D9D9"/>
+              <w:insideH w:val="single" w:sz="6" w:color="D9D9D9"/>
+              <w:insideV w:val="single" w:sz="6" w:color="D9D9D9"/>
+            </w:tcBorders>
+            <w:vAlign w:val="center"/>
+          </w:tcPr>
+          <w:p>
+            <w:pPr>
+              <w:spacing w:after="60"/>
+            </w:pPr>
+            <w:r>
+              <w:rPr>
+                <w:sz w:val="17"/>
+              </w:rPr>
+              <w:t>RNF-05</w:t>
+            </w:r>
+          </w:p>
+        </w:tc>
+        <w:tc>
+          <w:tcPr>
+            <w:tcW w:type="dxa" w:w="8640"/>
+            <w:tcBorders>
+              <w:top w:val="single" w:sz="6" w:color="D9D9D9"/>
+              <w:left w:val="single" w:sz="6" w:color="D9D9D9"/>
+              <w:bottom w:val="single" w:sz="6" w:color="D9D9D9"/>
+              <w:right w:val="single" w:sz="6" w:color="D9D9D9"/>
+              <w:insideH w:val="single" w:sz="6" w:color="D9D9D9"/>
+              <w:insideV w:val="single" w:sz="6" w:color="D9D9D9"/>
+            </w:tcBorders>
+            <w:vAlign w:val="center"/>
+          </w:tcPr>
+          <w:p>
+            <w:pPr>
+              <w:spacing w:after="60"/>
+            </w:pPr>
+            <w:r>
+              <w:rPr>
+                <w:sz w:val="17"/>
+              </w:rPr>
+              <w:t>Las imágenes tendrán texto alternativo y los formularios utilizarán etiquetas asociadas.</w:t>
+            </w:r>
+          </w:p>
+        </w:tc>
+      </w:tr>
+      <w:tr>
+        <w:tc>
+          <w:tcPr>
+            <w:tcW w:type="dxa" w:w="1224"/>
+            <w:shd w:fill="EAF6F6"/>
+            <w:tcBorders>
+              <w:top w:val="single" w:sz="6" w:color="D9D9D9"/>
+              <w:left w:val="single" w:sz="6" w:color="D9D9D9"/>
+              <w:bottom w:val="single" w:sz="6" w:color="D9D9D9"/>
+              <w:right w:val="single" w:sz="6" w:color="D9D9D9"/>
+              <w:insideH w:val="single" w:sz="6" w:color="D9D9D9"/>
+              <w:insideV w:val="single" w:sz="6" w:color="D9D9D9"/>
+            </w:tcBorders>
+            <w:vAlign w:val="center"/>
+          </w:tcPr>
+          <w:p>
+            <w:pPr>
+              <w:spacing w:after="60"/>
+            </w:pPr>
+            <w:r>
+              <w:rPr>
+                <w:sz w:val="17"/>
+              </w:rPr>
+              <w:t>RNF-06</w:t>
+            </w:r>
+          </w:p>
+        </w:tc>
+        <w:tc>
+          <w:tcPr>
+            <w:tcW w:type="dxa" w:w="8640"/>
+            <w:shd w:fill="EAF6F6"/>
+            <w:tcBorders>
+              <w:top w:val="single" w:sz="6" w:color="D9D9D9"/>
+              <w:left w:val="single" w:sz="6" w:color="D9D9D9"/>
+              <w:bottom w:val="single" w:sz="6" w:color="D9D9D9"/>
+              <w:right w:val="single" w:sz="6" w:color="D9D9D9"/>
+              <w:insideH w:val="single" w:sz="6" w:color="D9D9D9"/>
+              <w:insideV w:val="single" w:sz="6" w:color="D9D9D9"/>
+            </w:tcBorders>
+            <w:vAlign w:val="center"/>
+          </w:tcPr>
+          <w:p>
+            <w:pPr>
+              <w:spacing w:after="60"/>
+            </w:pPr>
+            <w:r>
+              <w:rPr>
+                <w:sz w:val="17"/>
+              </w:rPr>
+              <w:t>El proyecto podrá ejecutarse localmente mediante Apache en XAMPP.</w:t>
+            </w:r>
+          </w:p>
+        </w:tc>
+      </w:tr>
+      <w:tr>
+        <w:tc>
+          <w:tcPr>
+            <w:tcW w:type="dxa" w:w="1224"/>
+            <w:tcBorders>
+              <w:top w:val="single" w:sz="6" w:color="D9D9D9"/>
+              <w:left w:val="single" w:sz="6" w:color="D9D9D9"/>
+              <w:bottom w:val="single" w:sz="6" w:color="D9D9D9"/>
+              <w:right w:val="single" w:sz="6" w:color="D9D9D9"/>
+              <w:insideH w:val="single" w:sz="6" w:color="D9D9D9"/>
+              <w:insideV w:val="single" w:sz="6" w:color="D9D9D9"/>
+            </w:tcBorders>
+            <w:vAlign w:val="center"/>
+          </w:tcPr>
+          <w:p>
+            <w:pPr>
+              <w:spacing w:after="60"/>
+            </w:pPr>
+            <w:r>
+              <w:rPr>
+                <w:sz w:val="17"/>
+              </w:rPr>
+              <w:t>RNF-07</w:t>
+            </w:r>
+          </w:p>
+        </w:tc>
+        <w:tc>
+          <w:tcPr>
+            <w:tcW w:type="dxa" w:w="8640"/>
+            <w:tcBorders>
+              <w:top w:val="single" w:sz="6" w:color="D9D9D9"/>
+              <w:left w:val="single" w:sz="6" w:color="D9D9D9"/>
+              <w:bottom w:val="single" w:sz="6" w:color="D9D9D9"/>
+              <w:right w:val="single" w:sz="6" w:color="D9D9D9"/>
+              <w:insideH w:val="single" w:sz="6" w:color="D9D9D9"/>
+              <w:insideV w:val="single" w:sz="6" w:color="D9D9D9"/>
+            </w:tcBorders>
+            <w:vAlign w:val="center"/>
+          </w:tcPr>
+          <w:p>
+            <w:pPr>
+              <w:spacing w:after="60"/>
+            </w:pPr>
+            <w:r>
+              <w:rPr>
+                <w:sz w:val="17"/>
+              </w:rPr>
+              <w:t>La navegación y los mensajes deberán ser claros y consistentes en todas las páginas.</w:t>
+            </w:r>
+          </w:p>
+        </w:tc>
+      </w:tr>
+      <w:tr>
+        <w:tc>
+          <w:tcPr>
+            <w:tcW w:type="dxa" w:w="1224"/>
+            <w:shd w:fill="EAF6F6"/>
+            <w:tcBorders>
+              <w:top w:val="single" w:sz="6" w:color="D9D9D9"/>
+              <w:left w:val="single" w:sz="6" w:color="D9D9D9"/>
+              <w:bottom w:val="single" w:sz="6" w:color="D9D9D9"/>
+              <w:right w:val="single" w:sz="6" w:color="D9D9D9"/>
+              <w:insideH w:val="single" w:sz="6" w:color="D9D9D9"/>
+              <w:insideV w:val="single" w:sz="6" w:color="D9D9D9"/>
+            </w:tcBorders>
+            <w:vAlign w:val="center"/>
+          </w:tcPr>
+          <w:p>
+            <w:pPr>
+              <w:spacing w:after="60"/>
+            </w:pPr>
+            <w:r>
+              <w:rPr>
+                <w:sz w:val="17"/>
+              </w:rPr>
+              <w:t>RNF-08</w:t>
+            </w:r>
+          </w:p>
+        </w:tc>
+        <w:tc>
+          <w:tcPr>
+            <w:tcW w:type="dxa" w:w="8640"/>
+            <w:shd w:fill="EAF6F6"/>
+            <w:tcBorders>
+              <w:top w:val="single" w:sz="6" w:color="D9D9D9"/>
+              <w:left w:val="single" w:sz="6" w:color="D9D9D9"/>
+              <w:bottom w:val="single" w:sz="6" w:color="D9D9D9"/>
+              <w:right w:val="single" w:sz="6" w:color="D9D9D9"/>
+              <w:insideH w:val="single" w:sz="6" w:color="D9D9D9"/>
+              <w:insideV w:val="single" w:sz="6" w:color="D9D9D9"/>
+            </w:tcBorders>
+            <w:vAlign w:val="center"/>
+          </w:tcPr>
+          <w:p>
+            <w:pPr>
+              <w:spacing w:after="60"/>
+            </w:pPr>
+            <w:r>
+              <w:rPr>
+                <w:sz w:val="17"/>
+              </w:rPr>
+              <w:t>El proyecto utilizará HTML, CSS y JavaScript sin requerir una base de datos en esta versión.</w:t>
+            </w:r>
+          </w:p>
+        </w:tc>
+      </w:tr>
+    </w:tbl>
+    <w:p>
+      <w:pPr>
+        <w:spacing w:after="80"/>
+      </w:pPr>
+    </w:p>
+    <w:p>
+      <w:pPr>
+        <w:pStyle w:val="Ttulo1"/>
+        <w:spacing w:after="80"/>
+      </w:pPr>
+      <w:r>
+        <w:t>4 Herramientas y tecnologías</w:t>
+      </w:r>
+    </w:p>
+    <w:p>
+      <w:pPr>
+        <w:spacing w:after="80"/>
+        <w:ind w:left="360" w:hanging="259"/>
+      </w:pPr>
+      <w:r>
+        <w:t xml:space="preserve">• </w:t>
+      </w:r>
+      <w:r>
+        <w:t>Visual Studio Code para edición del proyecto.</w:t>
+      </w:r>
+    </w:p>
+    <w:p>
+      <w:pPr>
+        <w:spacing w:after="80"/>
+        <w:ind w:left="360" w:hanging="259"/>
+      </w:pPr>
+      <w:r>
+        <w:t xml:space="preserve">• </w:t>
+      </w:r>
+      <w:r>
+        <w:t>HTML5 para estructura y contenido.</w:t>
+      </w:r>
+    </w:p>
+    <w:p>
+      <w:pPr>
+        <w:spacing w:after="80"/>
+        <w:ind w:left="360" w:hanging="259"/>
+      </w:pPr>
+      <w:r>
+        <w:t xml:space="preserve">• </w:t>
+      </w:r>
+      <w:r>
+        <w:t>CSS3 externo para diseño y adaptación a diferentes pantallas.</w:t>
+      </w:r>
+    </w:p>
+    <w:p>
+      <w:pPr>
+        <w:spacing w:after="80"/>
+        <w:ind w:left="360" w:hanging="259"/>
+      </w:pPr>
+      <w:r>
+        <w:t xml:space="preserve">• </w:t>
+      </w:r>
+      <w:r>
+        <w:t>JavaScript para validaciones, catálogo, carrito, registro e inicio de sesión.</w:t>
+      </w:r>
+    </w:p>
+    <w:p>
+      <w:pPr>
+        <w:spacing w:after="80"/>
+        <w:ind w:left="360" w:hanging="259"/>
+      </w:pPr>
+      <w:r>
+        <w:t xml:space="preserve">• </w:t>
+      </w:r>
+      <w:r>
+        <w:t>localStorage para conservar temporalmente carrito, usuarios y sesión en el navegador.</w:t>
+      </w:r>
+    </w:p>
+    <w:p>
+      <w:pPr>
+        <w:spacing w:after="80"/>
+        <w:ind w:left="360" w:hanging="259"/>
+      </w:pPr>
+      <w:r>
+        <w:t xml:space="preserve">• </w:t>
+      </w:r>
+      <w:r>
+        <w:t>XAMPP y Apache para ejecutar el sitio en localhost.</w:t>
+      </w:r>
+    </w:p>
+    <w:p>
+      <w:pPr>
+        <w:spacing w:after="80"/>
+        <w:ind w:left="360" w:hanging="259"/>
+      </w:pPr>
+      <w:r>
+        <w:t xml:space="preserve">• </w:t>
+      </w:r>
+      <w:r>
+        <w:t>Git y GitHub para control de versiones y trabajo colaborativo.</w:t>
+      </w:r>
+    </w:p>
+    <w:p>
+      <w:pPr>
+        <w:pStyle w:val="Ttulo1"/>
+        <w:spacing w:after="80"/>
+      </w:pPr>
+      <w:r>
+        <w:t>5 Propuesta de solución</w:t>
+      </w:r>
+    </w:p>
+    <w:p>
+      <w:pPr>
+        <w:spacing w:after="80"/>
+      </w:pPr>
+      <w:r>
+        <w:t>Se propone una interfaz en tonos turquesa asociada a salud y confianza. La información se distribuye en páginas interconectadas. El catálogo permite seleccionar tratamientos y calcular un total referencial. El registro y el inicio de sesión funcionan como una demostración frontend. Los formularios entregan mensajes claros antes de aceptar los datos.</w:t>
+      </w:r>
+    </w:p>
+    <w:p>
+      <w:pPr>
+        <w:pStyle w:val="Ttulo1"/>
+        <w:spacing w:after="80"/>
+      </w:pPr>
+      <w:r>
+        <w:t>6 Restricciones</w:t>
+      </w:r>
+    </w:p>
+    <w:p>
+      <w:pPr>
+        <w:spacing w:after="80"/>
+        <w:ind w:left="360" w:hanging="259"/>
+      </w:pPr>
+      <w:r>
+        <w:t xml:space="preserve">• </w:t>
+      </w:r>
+      <w:r>
+        <w:t>El sitio no utiliza una base de datos ni un servidor de autenticación.</w:t>
+      </w:r>
+    </w:p>
+    <w:p>
+      <w:pPr>
+        <w:spacing w:after="80"/>
+        <w:ind w:left="360" w:hanging="259"/>
+      </w:pPr>
+      <w:r>
+        <w:t xml:space="preserve">• </w:t>
+      </w:r>
+      <w:r>
+        <w:t>Los usuarios, contraseñas, sesión y carrito se almacenan únicamente en localStorage con fines académicos.</w:t>
+      </w:r>
+    </w:p>
+    <w:p>
+      <w:pPr>
+        <w:spacing w:after="80"/>
+        <w:ind w:left="360" w:hanging="259"/>
+      </w:pPr>
+      <w:r>
+        <w:t xml:space="preserve">• </w:t>
+      </w:r>
+      <w:r>
+        <w:t>El inicio de sesión no representa un mecanismo seguro para un sistema real.</w:t>
+      </w:r>
+    </w:p>
+    <w:p>
+      <w:pPr>
+        <w:spacing w:after="80"/>
+        <w:ind w:left="360" w:hanging="259"/>
+      </w:pPr>
+      <w:r>
+        <w:t xml:space="preserve">• </w:t>
+      </w:r>
+      <w:r>
+        <w:t>El formulario no envía correos ni confirma horas reales.</w:t>
+      </w:r>
+    </w:p>
+    <w:p>
+      <w:pPr>
+        <w:spacing w:after="80"/>
+        <w:ind w:left="360" w:hanging="259"/>
+      </w:pPr>
+      <w:r>
+        <w:t xml:space="preserve">• </w:t>
+      </w:r>
+      <w:r>
+        <w:t>Los precios son referenciales y pertenecen a una clínica ficticia.</w:t>
+      </w:r>
+    </w:p>
+    <w:p>
+      <w:pPr>
+        <w:spacing w:after="80"/>
+        <w:ind w:left="360" w:hanging="259"/>
+      </w:pPr>
+      <w:r>
+        <w:t xml:space="preserve">• </w:t>
+      </w:r>
+      <w:r>
+        <w:t>El video requiere conexión a Internet para reproducirse.</w:t>
+      </w:r>
+    </w:p>
+    <w:p>
+      <w:pPr>
+        <w:pStyle w:val="Ttulo1"/>
+        <w:spacing w:after="80"/>
+      </w:pPr>
+      <w:r>
+        <w:t>7 Mejoras futuras</w:t>
+      </w:r>
+    </w:p>
+    <w:p>
+      <w:pPr>
+        <w:spacing w:after="80"/>
+        <w:ind w:left="360" w:hanging="259"/>
+      </w:pPr>
+      <w:r>
+        <w:t xml:space="preserve">• </w:t>
+      </w:r>
+      <w:r>
+        <w:t>Agregar una base de datos para usuarios, reservas y tratamientos.</w:t>
+      </w:r>
+    </w:p>
+    <w:p>
+      <w:pPr>
+        <w:spacing w:after="80"/>
+        <w:ind w:left="360" w:hanging="259"/>
+      </w:pPr>
+      <w:r>
+        <w:t xml:space="preserve">• </w:t>
+      </w:r>
+      <w:r>
+        <w:t>Implementar autenticación segura, recuperación de contraseña, perfiles de usuario y una vista administrativa.</w:t>
+      </w:r>
+    </w:p>
+    <w:p>
+      <w:pPr>
+        <w:spacing w:after="80"/>
+        <w:ind w:left="360" w:hanging="259"/>
+      </w:pPr>
+      <w:r>
+        <w:t xml:space="preserve">• </w:t>
+      </w:r>
+      <w:r>
+        <w:t>Mostrar horas disponibles en tiempo real y enviar confirmaciones por correo.</w:t>
+      </w:r>
+    </w:p>
     <w:sectPr>
       <w:pgSz w:w="12240" w:h="15840"/>
-      <w:pgMar w:top="1417" w:right="1701" w:bottom="1417" w:left="1701" w:header="708" w:footer="708" w:gutter="0"/>
+      <w:pgMar w:top="792" w:right="1008" w:bottom="792" w:left="1008" w:header="708" w:footer="708" w:gutter="0"/>
       <w:cols w:space="708"/>
       <w:docGrid w:linePitch="360"/>
     </w:sectPr>
@@ -725,6 +2054,10 @@
   <w:style w:type="paragraph" w:default="1" w:styleId="Normal">
     <w:name w:val="Normal"/>
     <w:qFormat/>
+    <w:rPr>
+      <w:rFonts w:ascii="Arial" w:hAnsi="Arial"/>
+      <w:sz w:val="20"/>
+    </w:rPr>
   </w:style>
   <w:style w:type="paragraph" w:styleId="Ttulo1">
     <w:name w:val="heading 1"/>
@@ -741,8 +2074,8 @@
       <w:outlineLvl w:val="0"/>
     </w:pPr>
     <w:rPr>
-      <w:rFonts w:asciiTheme="majorHAnsi" w:eastAsiaTheme="majorEastAsia" w:hAnsiTheme="majorHAnsi" w:cstheme="majorBidi"/>
-      <w:color w:val="0F4761" w:themeColor="accent1" w:themeShade="BF"/>
+      <w:rFonts w:asciiTheme="majorHAnsi" w:eastAsiaTheme="majorEastAsia" w:hAnsiTheme="majorHAnsi" w:cstheme="majorBidi" w:ascii="Arial" w:hAnsi="Arial"/>
+      <w:color w:val="000000"/>
       <w:sz w:val="40"/>
       <w:szCs w:val="40"/>
     </w:rPr>
@@ -764,8 +2097,8 @@
       <w:outlineLvl w:val="1"/>
     </w:pPr>
     <w:rPr>
-      <w:rFonts w:asciiTheme="majorHAnsi" w:eastAsiaTheme="majorEastAsia" w:hAnsiTheme="majorHAnsi" w:cstheme="majorBidi"/>
-      <w:color w:val="0F4761" w:themeColor="accent1" w:themeShade="BF"/>
+      <w:rFonts w:asciiTheme="majorHAnsi" w:eastAsiaTheme="majorEastAsia" w:hAnsiTheme="majorHAnsi" w:cstheme="majorBidi" w:ascii="Arial" w:hAnsi="Arial"/>
+      <w:color w:val="000000"/>
       <w:sz w:val="32"/>
       <w:szCs w:val="32"/>
     </w:rPr>
@@ -1083,7 +2416,8 @@
       <w:contextualSpacing/>
     </w:pPr>
     <w:rPr>
-      <w:rFonts w:asciiTheme="majorHAnsi" w:eastAsiaTheme="majorEastAsia" w:hAnsiTheme="majorHAnsi" w:cstheme="majorBidi"/>
+      <w:rFonts w:asciiTheme="majorHAnsi" w:eastAsiaTheme="majorEastAsia" w:hAnsiTheme="majorHAnsi" w:cstheme="majorBidi" w:ascii="Arial" w:hAnsi="Arial"/>
+      <w:color w:val="000000"/>
       <w:spacing w:val="-10"/>
       <w:kern w:val="28"/>
       <w:sz w:val="56"/>

</xml_diff>

<commit_message>
ajusta proyecto a la pauta de evaluacion
</commit_message>
<xml_diff>
--- a/ERS.docx
+++ b/ERS.docx
@@ -29,7 +29,7 @@
         <w:spacing w:after="80"/>
       </w:pPr>
       <w:r>
-        <w:t>Este documento describe el alcance actual del sitio web frontend de Clínica Aura e incorpora las funciones de catálogo, carrito, registro de usuarios e inicio de sesión implementadas en el proyecto.</w:t>
+        <w:t>Este documento describe el alcance del sitio web frontend de Clínica Aura de acuerdo con los requerimientos de la Evaluación Parcial 1.</w:t>
       </w:r>
     </w:p>
     <w:p>
@@ -72,7 +72,7 @@
         <w:spacing w:after="80"/>
       </w:pPr>
       <w:r>
-        <w:t>El sitio permite conocer la clínica, revisar tratamientos, consultar precios referenciales, preparar un pedido, registrar usuarios, iniciar sesión y enviar una solicitud de reserva. Los datos se almacenan solamente en el navegador.</w:t>
+        <w:t>El sitio permite conocer la clínica, revisar tratamientos y precios referenciales, reproducir un video educativo y completar un formulario para solicitar una reserva.</w:t>
       </w:r>
     </w:p>
     <w:p>
@@ -89,7 +89,7 @@
         <w:spacing w:after="80"/>
       </w:pPr>
       <w:r>
-        <w:t>Personas mayores de edad interesadas en servicios dentales o faciales que desean informarse, estimar tratamientos o solicitar una evaluación.</w:t>
+        <w:t>Personas interesadas en servicios dentales o faciales que desean informarse o solicitar una evaluación.</w:t>
       </w:r>
     </w:p>
     <w:p>
@@ -208,7 +208,7 @@
               <w:rPr>
                 <w:sz w:val="17"/>
               </w:rPr>
-              <w:t>El usuario podrá navegar entre Inicio, Nosotros, Tratamientos, Mi pedido, Reserva, Ingresar y Registro.</w:t>
+              <w:t>El usuario podrá navegar entre Inicio, Nosotros, Tratamientos y Reserva.</w:t>
             </w:r>
           </w:p>
         </w:tc>
@@ -581,324 +581,6 @@
                 <w:sz w:val="17"/>
               </w:rPr>
               <w:t>El botón Limpiar eliminará los datos, mensajes e indicadores visuales del formulario.</w:t>
-            </w:r>
-          </w:p>
-        </w:tc>
-      </w:tr>
-      <w:tr>
-        <w:tc>
-          <w:tcPr>
-            <w:tcW w:type="dxa" w:w="1224"/>
-            <w:tcBorders>
-              <w:top w:val="single" w:sz="6" w:color="D9D9D9"/>
-              <w:left w:val="single" w:sz="6" w:color="D9D9D9"/>
-              <w:bottom w:val="single" w:sz="6" w:color="D9D9D9"/>
-              <w:right w:val="single" w:sz="6" w:color="D9D9D9"/>
-              <w:insideH w:val="single" w:sz="6" w:color="D9D9D9"/>
-              <w:insideV w:val="single" w:sz="6" w:color="D9D9D9"/>
-            </w:tcBorders>
-            <w:vAlign w:val="center"/>
-          </w:tcPr>
-          <w:p>
-            <w:pPr>
-              <w:spacing w:after="60"/>
-            </w:pPr>
-            <w:r>
-              <w:rPr>
-                <w:sz w:val="17"/>
-              </w:rPr>
-              <w:t>RF-09</w:t>
-            </w:r>
-          </w:p>
-        </w:tc>
-        <w:tc>
-          <w:tcPr>
-            <w:tcW w:type="dxa" w:w="8640"/>
-            <w:tcBorders>
-              <w:top w:val="single" w:sz="6" w:color="D9D9D9"/>
-              <w:left w:val="single" w:sz="6" w:color="D9D9D9"/>
-              <w:bottom w:val="single" w:sz="6" w:color="D9D9D9"/>
-              <w:right w:val="single" w:sz="6" w:color="D9D9D9"/>
-              <w:insideH w:val="single" w:sz="6" w:color="D9D9D9"/>
-              <w:insideV w:val="single" w:sz="6" w:color="D9D9D9"/>
-            </w:tcBorders>
-            <w:vAlign w:val="center"/>
-          </w:tcPr>
-          <w:p>
-            <w:pPr>
-              <w:spacing w:after="60"/>
-            </w:pPr>
-            <w:r>
-              <w:rPr>
-                <w:sz w:val="17"/>
-              </w:rPr>
-              <w:t>JavaScript generará el catálogo desde un arreglo de tratamientos.</w:t>
-            </w:r>
-          </w:p>
-        </w:tc>
-      </w:tr>
-      <w:tr>
-        <w:tc>
-          <w:tcPr>
-            <w:tcW w:type="dxa" w:w="1224"/>
-            <w:shd w:fill="EAF6F6"/>
-            <w:tcBorders>
-              <w:top w:val="single" w:sz="6" w:color="D9D9D9"/>
-              <w:left w:val="single" w:sz="6" w:color="D9D9D9"/>
-              <w:bottom w:val="single" w:sz="6" w:color="D9D9D9"/>
-              <w:right w:val="single" w:sz="6" w:color="D9D9D9"/>
-              <w:insideH w:val="single" w:sz="6" w:color="D9D9D9"/>
-              <w:insideV w:val="single" w:sz="6" w:color="D9D9D9"/>
-            </w:tcBorders>
-            <w:vAlign w:val="center"/>
-          </w:tcPr>
-          <w:p>
-            <w:pPr>
-              <w:spacing w:after="60"/>
-            </w:pPr>
-            <w:r>
-              <w:rPr>
-                <w:sz w:val="17"/>
-              </w:rPr>
-              <w:t>RF-10</w:t>
-            </w:r>
-          </w:p>
-        </w:tc>
-        <w:tc>
-          <w:tcPr>
-            <w:tcW w:type="dxa" w:w="8640"/>
-            <w:shd w:fill="EAF6F6"/>
-            <w:tcBorders>
-              <w:top w:val="single" w:sz="6" w:color="D9D9D9"/>
-              <w:left w:val="single" w:sz="6" w:color="D9D9D9"/>
-              <w:bottom w:val="single" w:sz="6" w:color="D9D9D9"/>
-              <w:right w:val="single" w:sz="6" w:color="D9D9D9"/>
-              <w:insideH w:val="single" w:sz="6" w:color="D9D9D9"/>
-              <w:insideV w:val="single" w:sz="6" w:color="D9D9D9"/>
-            </w:tcBorders>
-            <w:vAlign w:val="center"/>
-          </w:tcPr>
-          <w:p>
-            <w:pPr>
-              <w:spacing w:after="60"/>
-            </w:pPr>
-            <w:r>
-              <w:rPr>
-                <w:sz w:val="17"/>
-              </w:rPr>
-              <w:t>El usuario podrá agregar tratamientos al carrito, revisar cantidades, subtotales y total, y eliminar elementos.</w:t>
-            </w:r>
-          </w:p>
-        </w:tc>
-      </w:tr>
-      <w:tr>
-        <w:tc>
-          <w:tcPr>
-            <w:tcW w:type="dxa" w:w="1224"/>
-            <w:tcBorders>
-              <w:top w:val="single" w:sz="6" w:color="D9D9D9"/>
-              <w:left w:val="single" w:sz="6" w:color="D9D9D9"/>
-              <w:bottom w:val="single" w:sz="6" w:color="D9D9D9"/>
-              <w:right w:val="single" w:sz="6" w:color="D9D9D9"/>
-              <w:insideH w:val="single" w:sz="6" w:color="D9D9D9"/>
-              <w:insideV w:val="single" w:sz="6" w:color="D9D9D9"/>
-            </w:tcBorders>
-            <w:vAlign w:val="center"/>
-          </w:tcPr>
-          <w:p>
-            <w:pPr>
-              <w:spacing w:after="60"/>
-            </w:pPr>
-            <w:r>
-              <w:rPr>
-                <w:sz w:val="17"/>
-              </w:rPr>
-              <w:t>RF-11</w:t>
-            </w:r>
-          </w:p>
-        </w:tc>
-        <w:tc>
-          <w:tcPr>
-            <w:tcW w:type="dxa" w:w="8640"/>
-            <w:tcBorders>
-              <w:top w:val="single" w:sz="6" w:color="D9D9D9"/>
-              <w:left w:val="single" w:sz="6" w:color="D9D9D9"/>
-              <w:bottom w:val="single" w:sz="6" w:color="D9D9D9"/>
-              <w:right w:val="single" w:sz="6" w:color="D9D9D9"/>
-              <w:insideH w:val="single" w:sz="6" w:color="D9D9D9"/>
-              <w:insideV w:val="single" w:sz="6" w:color="D9D9D9"/>
-            </w:tcBorders>
-            <w:vAlign w:val="center"/>
-          </w:tcPr>
-          <w:p>
-            <w:pPr>
-              <w:spacing w:after="60"/>
-            </w:pPr>
-            <w:r>
-              <w:rPr>
-                <w:sz w:val="17"/>
-              </w:rPr>
-              <w:t>El carrito se conservará en el navegador mediante localStorage.</w:t>
-            </w:r>
-          </w:p>
-        </w:tc>
-      </w:tr>
-      <w:tr>
-        <w:tc>
-          <w:tcPr>
-            <w:tcW w:type="dxa" w:w="1224"/>
-            <w:shd w:fill="EAF6F6"/>
-            <w:tcBorders>
-              <w:top w:val="single" w:sz="6" w:color="D9D9D9"/>
-              <w:left w:val="single" w:sz="6" w:color="D9D9D9"/>
-              <w:bottom w:val="single" w:sz="6" w:color="D9D9D9"/>
-              <w:right w:val="single" w:sz="6" w:color="D9D9D9"/>
-              <w:insideH w:val="single" w:sz="6" w:color="D9D9D9"/>
-              <w:insideV w:val="single" w:sz="6" w:color="D9D9D9"/>
-            </w:tcBorders>
-            <w:vAlign w:val="center"/>
-          </w:tcPr>
-          <w:p>
-            <w:pPr>
-              <w:spacing w:after="60"/>
-            </w:pPr>
-            <w:r>
-              <w:rPr>
-                <w:sz w:val="17"/>
-              </w:rPr>
-              <w:t>RF-12</w:t>
-            </w:r>
-          </w:p>
-        </w:tc>
-        <w:tc>
-          <w:tcPr>
-            <w:tcW w:type="dxa" w:w="8640"/>
-            <w:shd w:fill="EAF6F6"/>
-            <w:tcBorders>
-              <w:top w:val="single" w:sz="6" w:color="D9D9D9"/>
-              <w:left w:val="single" w:sz="6" w:color="D9D9D9"/>
-              <w:bottom w:val="single" w:sz="6" w:color="D9D9D9"/>
-              <w:right w:val="single" w:sz="6" w:color="D9D9D9"/>
-              <w:insideH w:val="single" w:sz="6" w:color="D9D9D9"/>
-              <w:insideV w:val="single" w:sz="6" w:color="D9D9D9"/>
-            </w:tcBorders>
-            <w:vAlign w:val="center"/>
-          </w:tcPr>
-          <w:p>
-            <w:pPr>
-              <w:spacing w:after="60"/>
-            </w:pPr>
-            <w:r>
-              <w:rPr>
-                <w:sz w:val="17"/>
-              </w:rPr>
-              <w:t>El usuario podrá registrarse con RUN válido sin puntos ni guion, nombre, apellidos, correo, contraseña, región, comuna y dirección.</w:t>
-            </w:r>
-          </w:p>
-        </w:tc>
-      </w:tr>
-      <w:tr>
-        <w:tc>
-          <w:tcPr>
-            <w:tcW w:type="dxa" w:w="1224"/>
-            <w:tcBorders>
-              <w:top w:val="single" w:sz="6" w:color="D9D9D9"/>
-              <w:left w:val="single" w:sz="6" w:color="D9D9D9"/>
-              <w:bottom w:val="single" w:sz="6" w:color="D9D9D9"/>
-              <w:right w:val="single" w:sz="6" w:color="D9D9D9"/>
-              <w:insideH w:val="single" w:sz="6" w:color="D9D9D9"/>
-              <w:insideV w:val="single" w:sz="6" w:color="D9D9D9"/>
-            </w:tcBorders>
-            <w:vAlign w:val="center"/>
-          </w:tcPr>
-          <w:p>
-            <w:pPr>
-              <w:spacing w:after="60"/>
-            </w:pPr>
-            <w:r>
-              <w:rPr>
-                <w:sz w:val="17"/>
-              </w:rPr>
-              <w:t>RF-13</w:t>
-            </w:r>
-          </w:p>
-        </w:tc>
-        <w:tc>
-          <w:tcPr>
-            <w:tcW w:type="dxa" w:w="8640"/>
-            <w:tcBorders>
-              <w:top w:val="single" w:sz="6" w:color="D9D9D9"/>
-              <w:left w:val="single" w:sz="6" w:color="D9D9D9"/>
-              <w:bottom w:val="single" w:sz="6" w:color="D9D9D9"/>
-              <w:right w:val="single" w:sz="6" w:color="D9D9D9"/>
-              <w:insideH w:val="single" w:sz="6" w:color="D9D9D9"/>
-              <w:insideV w:val="single" w:sz="6" w:color="D9D9D9"/>
-            </w:tcBorders>
-            <w:vAlign w:val="center"/>
-          </w:tcPr>
-          <w:p>
-            <w:pPr>
-              <w:spacing w:after="60"/>
-            </w:pPr>
-            <w:r>
-              <w:rPr>
-                <w:sz w:val="17"/>
-              </w:rPr>
-              <w:t>El registro aceptará solamente correos @duoc.cl, @profesor.duoc.cl y @gmail.com, y contraseñas de 4 a 10 caracteres.</w:t>
-            </w:r>
-          </w:p>
-        </w:tc>
-      </w:tr>
-      <w:tr>
-        <w:tc>
-          <w:tcPr>
-            <w:tcW w:type="dxa" w:w="1224"/>
-            <w:shd w:fill="EAF6F6"/>
-            <w:tcBorders>
-              <w:top w:val="single" w:sz="6" w:color="D9D9D9"/>
-              <w:left w:val="single" w:sz="6" w:color="D9D9D9"/>
-              <w:bottom w:val="single" w:sz="6" w:color="D9D9D9"/>
-              <w:right w:val="single" w:sz="6" w:color="D9D9D9"/>
-              <w:insideH w:val="single" w:sz="6" w:color="D9D9D9"/>
-              <w:insideV w:val="single" w:sz="6" w:color="D9D9D9"/>
-            </w:tcBorders>
-            <w:vAlign w:val="center"/>
-          </w:tcPr>
-          <w:p>
-            <w:pPr>
-              <w:spacing w:after="60"/>
-            </w:pPr>
-            <w:r>
-              <w:rPr>
-                <w:sz w:val="17"/>
-              </w:rPr>
-              <w:t>RF-14</w:t>
-            </w:r>
-          </w:p>
-        </w:tc>
-        <w:tc>
-          <w:tcPr>
-            <w:tcW w:type="dxa" w:w="8640"/>
-            <w:shd w:fill="EAF6F6"/>
-            <w:tcBorders>
-              <w:top w:val="single" w:sz="6" w:color="D9D9D9"/>
-              <w:left w:val="single" w:sz="6" w:color="D9D9D9"/>
-              <w:bottom w:val="single" w:sz="6" w:color="D9D9D9"/>
-              <w:right w:val="single" w:sz="6" w:color="D9D9D9"/>
-              <w:insideH w:val="single" w:sz="6" w:color="D9D9D9"/>
-              <w:insideV w:val="single" w:sz="6" w:color="D9D9D9"/>
-            </w:tcBorders>
-            <w:vAlign w:val="center"/>
-          </w:tcPr>
-          <w:p>
-            <w:pPr>
-              <w:spacing w:after="60"/>
-            </w:pPr>
-            <w:r>
-              <w:rPr>
-                <w:sz w:val="17"/>
-              </w:rPr>
-              <w:t>El usuario registrado podrá iniciar sesión con su correo y contraseña; la sesión se guardará en localStorage.</w:t>
             </w:r>
           </w:p>
         </w:tc>
@@ -1462,7 +1144,7 @@
         <w:t xml:space="preserve">• </w:t>
       </w:r>
       <w:r>
-        <w:t>JavaScript para validaciones, catálogo, carrito, registro e inicio de sesión.</w:t>
+        <w:t>JavaScript externo para validar el formulario de reserva.</w:t>
       </w:r>
     </w:p>
     <w:p>
@@ -1474,7 +1156,7 @@
         <w:t xml:space="preserve">• </w:t>
       </w:r>
       <w:r>
-        <w:t>localStorage para conservar temporalmente carrito, usuarios y sesión en el navegador.</w:t>
+        <w:t>XAMPP y Apache para ejecutar el sitio en localhost.</w:t>
       </w:r>
     </w:p>
     <w:p>
@@ -1486,7 +1168,33 @@
         <w:t xml:space="preserve">• </w:t>
       </w:r>
       <w:r>
-        <w:t>XAMPP y Apache para ejecutar el sitio en localhost.</w:t>
+        <w:t>Git y GitHub para control de versiones y trabajo colaborativo.</w:t>
+      </w:r>
+    </w:p>
+    <w:p>
+      <w:pPr>
+        <w:pStyle w:val="Ttulo1"/>
+        <w:spacing w:after="80"/>
+      </w:pPr>
+      <w:r>
+        <w:t>5 Propuesta de solución</w:t>
+      </w:r>
+    </w:p>
+    <w:p>
+      <w:pPr>
+        <w:spacing w:after="80"/>
+      </w:pPr>
+      <w:r>
+        <w:t>Se propone una interfaz en tonos turquesa asociada a salud y confianza. La información se distribuye en páginas interconectadas con estructura semántica HTML5. La hoja CSS externa mantiene un diseño uniforme y responsivo, mientras que JavaScript valida el formulario de reserva y entrega mensajes claros antes de aceptar los datos.</w:t>
+      </w:r>
+    </w:p>
+    <w:p>
+      <w:pPr>
+        <w:pStyle w:val="Ttulo1"/>
+        <w:spacing w:after="80"/>
+      </w:pPr>
+      <w:r>
+        <w:t>6 Restricciones</w:t>
       </w:r>
     </w:p>
     <w:p>
@@ -1498,7 +1206,19 @@
         <w:t xml:space="preserve">• </w:t>
       </w:r>
       <w:r>
-        <w:t>Git y GitHub para control de versiones y trabajo colaborativo.</w:t>
+        <w:t>El formulario no envía correos ni confirma horas reales.</w:t>
+      </w:r>
+    </w:p>
+    <w:p>
+      <w:pPr>
+        <w:spacing w:after="80"/>
+        <w:ind w:left="360" w:hanging="259"/>
+      </w:pPr>
+      <w:r>
+        <w:t xml:space="preserve">• </w:t>
+      </w:r>
+      <w:r>
+        <w:t>Los precios son referenciales y el video requiere conexión a Internet para reproducirse.</w:t>
       </w:r>
     </w:p>
     <w:p>
@@ -1507,24 +1227,7 @@
         <w:spacing w:after="80"/>
       </w:pPr>
       <w:r>
-        <w:t>5 Propuesta de solución</w:t>
-      </w:r>
-    </w:p>
-    <w:p>
-      <w:pPr>
-        <w:spacing w:after="80"/>
-      </w:pPr>
-      <w:r>
-        <w:t>Se propone una interfaz en tonos turquesa asociada a salud y confianza. La información se distribuye en páginas interconectadas. El catálogo permite seleccionar tratamientos y calcular un total referencial. El registro y el inicio de sesión funcionan como una demostración frontend. Los formularios entregan mensajes claros antes de aceptar los datos.</w:t>
-      </w:r>
-    </w:p>
-    <w:p>
-      <w:pPr>
-        <w:pStyle w:val="Ttulo1"/>
-        <w:spacing w:after="80"/>
-      </w:pPr>
-      <w:r>
-        <w:t>6 Restricciones</w:t>
+        <w:t>7 Mejoras futuras</w:t>
       </w:r>
     </w:p>
     <w:p>
@@ -1536,100 +1239,7 @@
         <w:t xml:space="preserve">• </w:t>
       </w:r>
       <w:r>
-        <w:t>El sitio no utiliza una base de datos ni un servidor de autenticación.</w:t>
-      </w:r>
-    </w:p>
-    <w:p>
-      <w:pPr>
-        <w:spacing w:after="80"/>
-        <w:ind w:left="360" w:hanging="259"/>
-      </w:pPr>
-      <w:r>
-        <w:t xml:space="preserve">• </w:t>
-      </w:r>
-      <w:r>
-        <w:t>Los usuarios, contraseñas, sesión y carrito se almacenan únicamente en localStorage con fines académicos.</w:t>
-      </w:r>
-    </w:p>
-    <w:p>
-      <w:pPr>
-        <w:spacing w:after="80"/>
-        <w:ind w:left="360" w:hanging="259"/>
-      </w:pPr>
-      <w:r>
-        <w:t xml:space="preserve">• </w:t>
-      </w:r>
-      <w:r>
-        <w:t>El inicio de sesión no representa un mecanismo seguro para un sistema real.</w:t>
-      </w:r>
-    </w:p>
-    <w:p>
-      <w:pPr>
-        <w:spacing w:after="80"/>
-        <w:ind w:left="360" w:hanging="259"/>
-      </w:pPr>
-      <w:r>
-        <w:t xml:space="preserve">• </w:t>
-      </w:r>
-      <w:r>
-        <w:t>El formulario no envía correos ni confirma horas reales.</w:t>
-      </w:r>
-    </w:p>
-    <w:p>
-      <w:pPr>
-        <w:spacing w:after="80"/>
-        <w:ind w:left="360" w:hanging="259"/>
-      </w:pPr>
-      <w:r>
-        <w:t xml:space="preserve">• </w:t>
-      </w:r>
-      <w:r>
-        <w:t>Los precios son referenciales y pertenecen a una clínica ficticia.</w:t>
-      </w:r>
-    </w:p>
-    <w:p>
-      <w:pPr>
-        <w:spacing w:after="80"/>
-        <w:ind w:left="360" w:hanging="259"/>
-      </w:pPr>
-      <w:r>
-        <w:t xml:space="preserve">• </w:t>
-      </w:r>
-      <w:r>
-        <w:t>El video requiere conexión a Internet para reproducirse.</w:t>
-      </w:r>
-    </w:p>
-    <w:p>
-      <w:pPr>
-        <w:pStyle w:val="Ttulo1"/>
-        <w:spacing w:after="80"/>
-      </w:pPr>
-      <w:r>
-        <w:t>7 Mejoras futuras</w:t>
-      </w:r>
-    </w:p>
-    <w:p>
-      <w:pPr>
-        <w:spacing w:after="80"/>
-        <w:ind w:left="360" w:hanging="259"/>
-      </w:pPr>
-      <w:r>
-        <w:t xml:space="preserve">• </w:t>
-      </w:r>
-      <w:r>
-        <w:t>Agregar una base de datos para usuarios, reservas y tratamientos.</w:t>
-      </w:r>
-    </w:p>
-    <w:p>
-      <w:pPr>
-        <w:spacing w:after="80"/>
-        <w:ind w:left="360" w:hanging="259"/>
-      </w:pPr>
-      <w:r>
-        <w:t xml:space="preserve">• </w:t>
-      </w:r>
-      <w:r>
-        <w:t>Implementar autenticación segura, recuperación de contraseña, perfiles de usuario y una vista administrativa.</w:t>
+        <w:t>Agregar una base de datos para reservas y tratamientos.</w:t>
       </w:r>
     </w:p>
     <w:p>
@@ -2261,6 +1871,7 @@
   <w:style w:type="character" w:default="1" w:styleId="Fuentedeprrafopredeter">
     <w:name w:val="Default Paragraph Font"/>
     <w:uiPriority w:val="1"/>
+    <w:semiHidden/>
     <w:unhideWhenUsed/>
   </w:style>
   <w:style w:type="table" w:default="1" w:styleId="Tablanormal">

</xml_diff>